<commit_message>
Sprint 2 Final: Added xUnit/Vitest tests, Playwright E2E, and Final Reports
</commit_message>
<xml_diff>
--- a/Final_Report_Nikhil_Kumar_Sahu.docx
+++ b/Final_Report_Nikhil_Kumar_Sahu.docx
@@ -42,7 +42,25 @@
           <w:sz w:val="40"/>
           <w:szCs w:val="40"/>
         </w:rPr>
-        <w:t>(Sprint – 1)</w:t>
+        <w:t xml:space="preserve">(Sprint – </w:t>
+      </w:r>
+      <w:r>
+        <w:rPr>
+          <w:b/>
+          <w:bCs/>
+          <w:sz w:val="40"/>
+          <w:szCs w:val="40"/>
+        </w:rPr>
+        <w:t>2</w:t>
+      </w:r>
+      <w:r>
+        <w:rPr>
+          <w:b/>
+          <w:bCs/>
+          <w:sz w:val="40"/>
+          <w:szCs w:val="40"/>
+        </w:rPr>
+        <w:t>)</w:t>
       </w:r>
     </w:p>
     <w:p>
@@ -72,7 +90,50 @@
           <w:szCs w:val="32"/>
           <w:u w:val="single"/>
         </w:rPr>
-        <w:t>Project Title</w:t>
+        <w:t>Project Title :</w:t>
+      </w:r>
+      <w:r>
+        <w:rPr>
+          <w:b/>
+          <w:bCs/>
+          <w:sz w:val="28"/>
+          <w:szCs w:val="28"/>
+        </w:rPr>
+        <w:t xml:space="preserve"> </w:t>
+      </w:r>
+      <w:r>
+        <w:rPr>
+          <w:b/>
+          <w:bCs/>
+          <w:sz w:val="28"/>
+          <w:szCs w:val="28"/>
+        </w:rPr>
+        <w:t xml:space="preserve"> </w:t>
+      </w:r>
+      <w:proofErr w:type="spellStart"/>
+      <w:r>
+        <w:rPr>
+          <w:sz w:val="28"/>
+          <w:szCs w:val="28"/>
+        </w:rPr>
+        <w:t>Fracto</w:t>
+      </w:r>
+      <w:proofErr w:type="spellEnd"/>
+      <w:r>
+        <w:rPr>
+          <w:sz w:val="28"/>
+          <w:szCs w:val="28"/>
+        </w:rPr>
+        <w:t xml:space="preserve"> - Doctor Appointment Booking System</w:t>
+      </w:r>
+      <w:r>
+        <w:rPr>
+          <w:b/>
+          <w:bCs/>
+          <w:sz w:val="28"/>
+          <w:szCs w:val="28"/>
+        </w:rPr>
+        <w:br/>
       </w:r>
       <w:r>
         <w:rPr>
@@ -82,12 +143,10 @@
           <w:szCs w:val="32"/>
           <w:u w:val="single"/>
         </w:rPr>
-        <w:t xml:space="preserve"> </w:t>
-      </w:r>
-      <w:r>
-        <w:rPr>
-          <w:b/>
-          <w:bCs/>
+        <w:t xml:space="preserve">Student Name </w:t>
+      </w:r>
+      <w:r>
+        <w:rPr>
           <w:sz w:val="32"/>
           <w:szCs w:val="32"/>
           <w:u w:val="single"/>
@@ -96,42 +155,10 @@
       </w:r>
       <w:r>
         <w:rPr>
-          <w:b/>
-          <w:bCs/>
           <w:sz w:val="28"/>
           <w:szCs w:val="28"/>
         </w:rPr>
-        <w:t xml:space="preserve"> </w:t>
-      </w:r>
-      <w:r>
-        <w:rPr>
-          <w:b/>
-          <w:bCs/>
-          <w:sz w:val="28"/>
-          <w:szCs w:val="28"/>
-        </w:rPr>
-        <w:t xml:space="preserve"> </w:t>
-      </w:r>
-      <w:r>
-        <w:rPr>
-          <w:sz w:val="28"/>
-          <w:szCs w:val="28"/>
-        </w:rPr>
-        <w:t>Fracto</w:t>
-      </w:r>
-      <w:r>
-        <w:rPr>
-          <w:sz w:val="28"/>
-          <w:szCs w:val="28"/>
-        </w:rPr>
-        <w:t xml:space="preserve"> -</w:t>
-      </w:r>
-      <w:r>
-        <w:rPr>
-          <w:sz w:val="28"/>
-          <w:szCs w:val="28"/>
-        </w:rPr>
-        <w:t xml:space="preserve"> Doctor Appointment Booking System</w:t>
+        <w:t xml:space="preserve">  Nikhil Kumar Sahu</w:t>
       </w:r>
       <w:r>
         <w:rPr>
@@ -150,7 +177,39 @@
           <w:szCs w:val="32"/>
           <w:u w:val="single"/>
         </w:rPr>
-        <w:t>Student Nam</w:t>
+        <w:t>Date :</w:t>
+      </w:r>
+      <w:r>
+        <w:rPr>
+          <w:b/>
+          <w:bCs/>
+          <w:sz w:val="28"/>
+          <w:szCs w:val="28"/>
+        </w:rPr>
+        <w:t xml:space="preserve">  </w:t>
+      </w:r>
+      <w:r>
+        <w:rPr>
+          <w:sz w:val="28"/>
+          <w:szCs w:val="28"/>
+        </w:rPr>
+        <w:t xml:space="preserve">26 </w:t>
+      </w:r>
+      <w:r>
+        <w:rPr>
+          <w:sz w:val="28"/>
+          <w:szCs w:val="28"/>
+        </w:rPr>
+        <w:t>March 2026</w:t>
+      </w:r>
+      <w:r>
+        <w:rPr>
+          <w:b/>
+          <w:bCs/>
+          <w:sz w:val="28"/>
+          <w:szCs w:val="28"/>
+        </w:rPr>
+        <w:br/>
       </w:r>
       <w:r>
         <w:rPr>
@@ -160,164 +219,62 @@
           <w:szCs w:val="32"/>
           <w:u w:val="single"/>
         </w:rPr>
-        <w:t xml:space="preserve">e </w:t>
-      </w:r>
-      <w:r>
-        <w:rPr>
+        <w:t>Instructor Details :</w:t>
+      </w:r>
+      <w:r>
+        <w:rPr>
+          <w:b/>
+          <w:bCs/>
+          <w:sz w:val="28"/>
+          <w:szCs w:val="28"/>
+        </w:rPr>
+        <w:t xml:space="preserve"> </w:t>
+      </w:r>
+      <w:r>
+        <w:rPr>
+          <w:sz w:val="28"/>
+          <w:szCs w:val="28"/>
+        </w:rPr>
+        <w:t xml:space="preserve">Mr. Ramesh </w:t>
+      </w:r>
+      <w:proofErr w:type="spellStart"/>
+      <w:r>
+        <w:rPr>
+          <w:sz w:val="28"/>
+          <w:szCs w:val="28"/>
+        </w:rPr>
+        <w:t>Nediyadath</w:t>
+      </w:r>
+      <w:proofErr w:type="spellEnd"/>
+    </w:p>
+    <w:p>
+      <w:pPr>
+        <w:jc w:val="center"/>
+        <w:rPr>
+          <w:sz w:val="28"/>
+          <w:szCs w:val="28"/>
+        </w:rPr>
+      </w:pPr>
+      <w:r>
+        <w:rPr>
+          <w:b/>
+          <w:bCs/>
           <w:sz w:val="32"/>
           <w:szCs w:val="32"/>
-          <w:u w:val="single"/>
-        </w:rPr>
-        <w:t>:</w:t>
-      </w:r>
-      <w:r>
-        <w:rPr>
-          <w:sz w:val="28"/>
-          <w:szCs w:val="28"/>
-        </w:rPr>
-        <w:t xml:space="preserve"> </w:t>
-      </w:r>
-      <w:r>
-        <w:rPr>
-          <w:sz w:val="28"/>
-          <w:szCs w:val="28"/>
-        </w:rPr>
-        <w:t> Nikhil Kumar Sahu</w:t>
-      </w:r>
-      <w:r>
-        <w:rPr>
-          <w:b/>
-          <w:bCs/>
-          <w:sz w:val="28"/>
-          <w:szCs w:val="28"/>
-        </w:rPr>
-        <w:br/>
-      </w:r>
+        </w:rPr>
+        <w:t xml:space="preserve">Batch </w:t>
+      </w:r>
+      <w:proofErr w:type="gramStart"/>
       <w:r>
         <w:rPr>
           <w:b/>
           <w:bCs/>
           <w:sz w:val="32"/>
           <w:szCs w:val="32"/>
-          <w:u w:val="single"/>
-        </w:rPr>
-        <w:t>Date</w:t>
-      </w:r>
-      <w:r>
-        <w:rPr>
-          <w:b/>
-          <w:bCs/>
-          <w:sz w:val="32"/>
-          <w:szCs w:val="32"/>
-          <w:u w:val="single"/>
-        </w:rPr>
-        <w:t xml:space="preserve"> </w:t>
-      </w:r>
-      <w:r>
-        <w:rPr>
-          <w:b/>
-          <w:bCs/>
-          <w:sz w:val="32"/>
-          <w:szCs w:val="32"/>
-          <w:u w:val="single"/>
-        </w:rPr>
-        <w:t>:</w:t>
-      </w:r>
-      <w:r>
-        <w:rPr>
-          <w:b/>
-          <w:bCs/>
-          <w:sz w:val="28"/>
-          <w:szCs w:val="28"/>
-        </w:rPr>
-        <w:t> </w:t>
-      </w:r>
-      <w:r>
-        <w:rPr>
-          <w:b/>
-          <w:bCs/>
-          <w:sz w:val="28"/>
-          <w:szCs w:val="28"/>
-        </w:rPr>
-        <w:t xml:space="preserve"> </w:t>
-      </w:r>
-      <w:r>
-        <w:rPr>
-          <w:sz w:val="28"/>
-          <w:szCs w:val="28"/>
-        </w:rPr>
-        <w:t xml:space="preserve">16 </w:t>
-      </w:r>
-      <w:r>
-        <w:rPr>
-          <w:sz w:val="28"/>
-          <w:szCs w:val="28"/>
-        </w:rPr>
-        <w:t>March 2026</w:t>
-      </w:r>
-      <w:r>
-        <w:rPr>
-          <w:b/>
-          <w:bCs/>
-          <w:sz w:val="28"/>
-          <w:szCs w:val="28"/>
-        </w:rPr>
-        <w:br/>
-      </w:r>
-      <w:r>
-        <w:rPr>
-          <w:b/>
-          <w:bCs/>
-          <w:sz w:val="32"/>
-          <w:szCs w:val="32"/>
-          <w:u w:val="single"/>
-        </w:rPr>
-        <w:t>Instructor Details</w:t>
-      </w:r>
-      <w:r>
-        <w:rPr>
-          <w:b/>
-          <w:bCs/>
-          <w:sz w:val="32"/>
-          <w:szCs w:val="32"/>
-          <w:u w:val="single"/>
-        </w:rPr>
-        <w:t xml:space="preserve"> :</w:t>
-      </w:r>
-      <w:r>
-        <w:rPr>
-          <w:b/>
-          <w:bCs/>
-          <w:sz w:val="28"/>
-          <w:szCs w:val="28"/>
-        </w:rPr>
-        <w:t xml:space="preserve"> </w:t>
-      </w:r>
-      <w:r>
-        <w:rPr>
-          <w:sz w:val="28"/>
-          <w:szCs w:val="28"/>
-        </w:rPr>
-        <w:t>Mr. Ramesh Nediyadath</w:t>
-      </w:r>
-    </w:p>
-    <w:p>
-      <w:pPr>
-        <w:jc w:val="center"/>
-        <w:rPr>
-          <w:sz w:val="28"/>
-          <w:szCs w:val="28"/>
-        </w:rPr>
-      </w:pPr>
-      <w:r>
-        <w:rPr>
-          <w:b/>
-          <w:bCs/>
-          <w:sz w:val="32"/>
-          <w:szCs w:val="32"/>
-        </w:rPr>
-        <w:t>Batch Name :</w:t>
-      </w:r>
+        </w:rPr>
+        <w:t>Name :</w:t>
+      </w:r>
+      <w:proofErr w:type="gramEnd"/>
       <w:r>
         <w:rPr>
           <w:sz w:val="28"/>
@@ -394,8 +351,19 @@
                 <w:sz w:val="36"/>
                 <w:szCs w:val="36"/>
               </w:rPr>
-              <w:t>Table of Contents :</w:t>
-            </w:r>
+              <w:t xml:space="preserve">Table of </w:t>
+            </w:r>
+            <w:proofErr w:type="gramStart"/>
+            <w:r>
+              <w:rPr>
+                <w:b/>
+                <w:bCs/>
+                <w:sz w:val="36"/>
+                <w:szCs w:val="36"/>
+              </w:rPr>
+              <w:t>Contents :</w:t>
+            </w:r>
+            <w:proofErr w:type="gramEnd"/>
           </w:p>
         </w:tc>
         <w:tc>
@@ -1076,16 +1044,7 @@
           <w:sz w:val="28"/>
           <w:szCs w:val="28"/>
         </w:rPr>
-        <w:t>Problem Definition and Objectives</w:t>
-      </w:r>
-      <w:r>
-        <w:rPr>
-          <w:b/>
-          <w:bCs/>
-          <w:sz w:val="28"/>
-          <w:szCs w:val="28"/>
-        </w:rPr>
-        <w:t>:</w:t>
+        <w:t>Problem Definition and Objectives:</w:t>
       </w:r>
     </w:p>
     <w:p>
@@ -1160,7 +1119,15 @@
         <w:jc w:val="both"/>
       </w:pPr>
       <w:r>
-        <w:t>Implement secure authentication using JWT tokens and salted password hashing (via ASP.NET Core Identity IPasswordHasher) so that users and admins have role-based access control.</w:t>
+        <w:t xml:space="preserve">Implement secure authentication using JWT tokens and salted password hashing (via ASP.NET Core Identity </w:t>
+      </w:r>
+      <w:proofErr w:type="spellStart"/>
+      <w:r>
+        <w:t>IPasswordHasher</w:t>
+      </w:r>
+      <w:proofErr w:type="spellEnd"/>
+      <w:r>
+        <w:t>) so that users and admins have role-based access control.</w:t>
       </w:r>
     </w:p>
     <w:p>
@@ -1182,7 +1149,23 @@
         <w:t>real-time notifications</w:t>
       </w:r>
       <w:r>
-        <w:t> to users (appointment approved/cancelled) and admins (new booking) via SignalR WebSockets.</w:t>
+        <w:t xml:space="preserve"> to users (appointment approved/cancelled) and admins (new booking) via </w:t>
+      </w:r>
+      <w:proofErr w:type="spellStart"/>
+      <w:r>
+        <w:t>SignalR</w:t>
+      </w:r>
+      <w:proofErr w:type="spellEnd"/>
+      <w:r>
+        <w:t xml:space="preserve"> </w:t>
+      </w:r>
+      <w:proofErr w:type="spellStart"/>
+      <w:r>
+        <w:t>WebSockets</w:t>
+      </w:r>
+      <w:proofErr w:type="spellEnd"/>
+      <w:r>
+        <w:t>.</w:t>
       </w:r>
     </w:p>
     <w:p>
@@ -1436,8 +1419,21 @@
               <w:spacing w:after="160" w:line="278" w:lineRule="auto"/>
               <w:jc w:val="both"/>
             </w:pPr>
-            <w:r>
-              <w:t>SignalR (WebSockets)</w:t>
+            <w:proofErr w:type="spellStart"/>
+            <w:r>
+              <w:t>SignalR</w:t>
+            </w:r>
+            <w:proofErr w:type="spellEnd"/>
+            <w:r>
+              <w:t xml:space="preserve"> (</w:t>
+            </w:r>
+            <w:proofErr w:type="spellStart"/>
+            <w:r>
+              <w:t>WebSockets</w:t>
+            </w:r>
+            <w:proofErr w:type="spellEnd"/>
+            <w:r>
+              <w:t>)</w:t>
             </w:r>
           </w:p>
         </w:tc>
@@ -1567,6 +1563,7 @@
       </w:pPr>
       <w:r>
         <w:rPr>
+          <w:noProof/>
           <w:lang w:val="en-US"/>
         </w:rPr>
         <w:drawing>
@@ -1728,6 +1725,7 @@
               <w:spacing w:after="160" w:line="278" w:lineRule="auto"/>
               <w:jc w:val="both"/>
             </w:pPr>
+            <w:proofErr w:type="gramStart"/>
             <w:r>
               <w:t xml:space="preserve">POST </w:t>
             </w:r>
@@ -1735,7 +1733,16 @@
               <w:t xml:space="preserve"> </w:t>
             </w:r>
             <w:r>
-              <w:t>/api/auth/register</w:t>
+              <w:t>/</w:t>
+            </w:r>
+            <w:proofErr w:type="spellStart"/>
+            <w:proofErr w:type="gramEnd"/>
+            <w:r>
+              <w:t>api</w:t>
+            </w:r>
+            <w:proofErr w:type="spellEnd"/>
+            <w:r>
+              <w:t>/auth/register</w:t>
             </w:r>
           </w:p>
         </w:tc>
@@ -1787,6 +1794,7 @@
               <w:spacing w:after="160" w:line="278" w:lineRule="auto"/>
               <w:jc w:val="both"/>
             </w:pPr>
+            <w:proofErr w:type="gramStart"/>
             <w:r>
               <w:t>POST</w:t>
             </w:r>
@@ -1794,7 +1802,16 @@
               <w:t xml:space="preserve"> </w:t>
             </w:r>
             <w:r>
-              <w:t xml:space="preserve"> /api/auth/login</w:t>
+              <w:t xml:space="preserve"> /</w:t>
+            </w:r>
+            <w:proofErr w:type="spellStart"/>
+            <w:proofErr w:type="gramEnd"/>
+            <w:r>
+              <w:t>api</w:t>
+            </w:r>
+            <w:proofErr w:type="spellEnd"/>
+            <w:r>
+              <w:t>/auth/login</w:t>
             </w:r>
           </w:p>
         </w:tc>
@@ -1846,6 +1863,7 @@
               <w:spacing w:after="160" w:line="278" w:lineRule="auto"/>
               <w:jc w:val="both"/>
             </w:pPr>
+            <w:proofErr w:type="gramStart"/>
             <w:r>
               <w:t>GET</w:t>
             </w:r>
@@ -1853,7 +1871,16 @@
               <w:t xml:space="preserve"> </w:t>
             </w:r>
             <w:r>
-              <w:t xml:space="preserve"> /api/auth/me</w:t>
+              <w:t xml:space="preserve"> /</w:t>
+            </w:r>
+            <w:proofErr w:type="spellStart"/>
+            <w:proofErr w:type="gramEnd"/>
+            <w:r>
+              <w:t>api</w:t>
+            </w:r>
+            <w:proofErr w:type="spellEnd"/>
+            <w:r>
+              <w:t>/auth/me</w:t>
             </w:r>
           </w:p>
         </w:tc>
@@ -1905,6 +1932,7 @@
               <w:spacing w:after="160" w:line="278" w:lineRule="auto"/>
               <w:jc w:val="both"/>
             </w:pPr>
+            <w:proofErr w:type="gramStart"/>
             <w:r>
               <w:t xml:space="preserve">GET </w:t>
             </w:r>
@@ -1912,7 +1940,16 @@
               <w:t xml:space="preserve"> </w:t>
             </w:r>
             <w:r>
-              <w:t>/api/doctors</w:t>
+              <w:t>/</w:t>
+            </w:r>
+            <w:proofErr w:type="spellStart"/>
+            <w:proofErr w:type="gramEnd"/>
+            <w:r>
+              <w:t>api</w:t>
+            </w:r>
+            <w:proofErr w:type="spellEnd"/>
+            <w:r>
+              <w:t>/doctors</w:t>
             </w:r>
           </w:p>
         </w:tc>
@@ -1958,6 +1995,7 @@
               <w:spacing w:after="160" w:line="278" w:lineRule="auto"/>
               <w:jc w:val="both"/>
             </w:pPr>
+            <w:proofErr w:type="gramStart"/>
             <w:r>
               <w:t xml:space="preserve">GET </w:t>
             </w:r>
@@ -1965,7 +2003,16 @@
               <w:t xml:space="preserve"> </w:t>
             </w:r>
             <w:r>
-              <w:t>/api/doctors/{id}/available-slots</w:t>
+              <w:t>/</w:t>
+            </w:r>
+            <w:proofErr w:type="spellStart"/>
+            <w:proofErr w:type="gramEnd"/>
+            <w:r>
+              <w:t>api</w:t>
+            </w:r>
+            <w:proofErr w:type="spellEnd"/>
+            <w:r>
+              <w:t>/doctors/{id}/available-slots</w:t>
             </w:r>
           </w:p>
         </w:tc>
@@ -2011,6 +2058,7 @@
               <w:spacing w:after="160" w:line="278" w:lineRule="auto"/>
               <w:jc w:val="both"/>
             </w:pPr>
+            <w:proofErr w:type="gramStart"/>
             <w:r>
               <w:t>GET</w:t>
             </w:r>
@@ -2018,7 +2066,16 @@
               <w:t xml:space="preserve"> </w:t>
             </w:r>
             <w:r>
-              <w:t xml:space="preserve"> /api/appointments/my</w:t>
+              <w:t xml:space="preserve"> /</w:t>
+            </w:r>
+            <w:proofErr w:type="spellStart"/>
+            <w:proofErr w:type="gramEnd"/>
+            <w:r>
+              <w:t>api</w:t>
+            </w:r>
+            <w:proofErr w:type="spellEnd"/>
+            <w:r>
+              <w:t>/appointments/my</w:t>
             </w:r>
           </w:p>
         </w:tc>
@@ -2064,6 +2121,7 @@
               <w:spacing w:after="160" w:line="278" w:lineRule="auto"/>
               <w:jc w:val="both"/>
             </w:pPr>
+            <w:proofErr w:type="gramStart"/>
             <w:r>
               <w:lastRenderedPageBreak/>
               <w:t>POST</w:t>
@@ -2072,7 +2130,16 @@
               <w:t xml:space="preserve"> </w:t>
             </w:r>
             <w:r>
-              <w:t xml:space="preserve"> /api/appointments</w:t>
+              <w:t xml:space="preserve"> /</w:t>
+            </w:r>
+            <w:proofErr w:type="spellStart"/>
+            <w:proofErr w:type="gramEnd"/>
+            <w:r>
+              <w:t>api</w:t>
+            </w:r>
+            <w:proofErr w:type="spellEnd"/>
+            <w:r>
+              <w:t>/appointments</w:t>
             </w:r>
           </w:p>
         </w:tc>
@@ -2118,6 +2185,7 @@
               <w:spacing w:after="160" w:line="278" w:lineRule="auto"/>
               <w:jc w:val="both"/>
             </w:pPr>
+            <w:proofErr w:type="gramStart"/>
             <w:r>
               <w:t xml:space="preserve">DELETE </w:t>
             </w:r>
@@ -2125,7 +2193,16 @@
               <w:t xml:space="preserve"> </w:t>
             </w:r>
             <w:r>
-              <w:t>/api/appointments/{id}</w:t>
+              <w:t>/</w:t>
+            </w:r>
+            <w:proofErr w:type="spellStart"/>
+            <w:proofErr w:type="gramEnd"/>
+            <w:r>
+              <w:t>api</w:t>
+            </w:r>
+            <w:proofErr w:type="spellEnd"/>
+            <w:r>
+              <w:t>/appointments/{id}</w:t>
             </w:r>
           </w:p>
         </w:tc>
@@ -2175,7 +2252,15 @@
               <w:jc w:val="both"/>
             </w:pPr>
             <w:r>
-              <w:t>GET /api/ratings</w:t>
+              <w:t>GET /</w:t>
+            </w:r>
+            <w:proofErr w:type="spellStart"/>
+            <w:r>
+              <w:t>api</w:t>
+            </w:r>
+            <w:proofErr w:type="spellEnd"/>
+            <w:r>
+              <w:t>/ratings</w:t>
             </w:r>
           </w:p>
         </w:tc>
@@ -2222,7 +2307,15 @@
               <w:jc w:val="both"/>
             </w:pPr>
             <w:r>
-              <w:t>POST /api/ratings</w:t>
+              <w:t>POST /</w:t>
+            </w:r>
+            <w:proofErr w:type="spellStart"/>
+            <w:r>
+              <w:t>api</w:t>
+            </w:r>
+            <w:proofErr w:type="spellEnd"/>
+            <w:r>
+              <w:t>/ratings</w:t>
             </w:r>
           </w:p>
         </w:tc>
@@ -2269,7 +2362,15 @@
               <w:jc w:val="both"/>
             </w:pPr>
             <w:r>
-              <w:t>GET /api/admin/stats</w:t>
+              <w:t>GET /</w:t>
+            </w:r>
+            <w:proofErr w:type="spellStart"/>
+            <w:r>
+              <w:t>api</w:t>
+            </w:r>
+            <w:proofErr w:type="spellEnd"/>
+            <w:r>
+              <w:t>/admin/stats</w:t>
             </w:r>
           </w:p>
         </w:tc>
@@ -2316,7 +2417,15 @@
               <w:jc w:val="both"/>
             </w:pPr>
             <w:r>
-              <w:t>GET/POST/PUT/DELETE /api/admin/users</w:t>
+              <w:t>GET/POST/PUT/DELETE /</w:t>
+            </w:r>
+            <w:proofErr w:type="spellStart"/>
+            <w:r>
+              <w:t>api</w:t>
+            </w:r>
+            <w:proofErr w:type="spellEnd"/>
+            <w:r>
+              <w:t>/admin/users</w:t>
             </w:r>
           </w:p>
         </w:tc>
@@ -2363,7 +2472,15 @@
               <w:jc w:val="both"/>
             </w:pPr>
             <w:r>
-              <w:t>GET/POST/PUT/DELETE /api/admin/doctors</w:t>
+              <w:t>GET/POST/PUT/DELETE /</w:t>
+            </w:r>
+            <w:proofErr w:type="spellStart"/>
+            <w:r>
+              <w:t>api</w:t>
+            </w:r>
+            <w:proofErr w:type="spellEnd"/>
+            <w:r>
+              <w:t>/admin/doctors</w:t>
             </w:r>
           </w:p>
         </w:tc>
@@ -2410,7 +2527,15 @@
               <w:jc w:val="both"/>
             </w:pPr>
             <w:r>
-              <w:t>GET /api/admin/appointments</w:t>
+              <w:t>GET /</w:t>
+            </w:r>
+            <w:proofErr w:type="spellStart"/>
+            <w:r>
+              <w:t>api</w:t>
+            </w:r>
+            <w:proofErr w:type="spellEnd"/>
+            <w:r>
+              <w:t>/admin/appointments</w:t>
             </w:r>
           </w:p>
         </w:tc>
@@ -2457,7 +2582,15 @@
               <w:jc w:val="both"/>
             </w:pPr>
             <w:r>
-              <w:t>PUT /api/admin/appointments/{id}/approve</w:t>
+              <w:t>PUT /</w:t>
+            </w:r>
+            <w:proofErr w:type="spellStart"/>
+            <w:r>
+              <w:t>api</w:t>
+            </w:r>
+            <w:proofErr w:type="spellEnd"/>
+            <w:r>
+              <w:t>/admin/appointments/{id}/approve</w:t>
             </w:r>
           </w:p>
         </w:tc>
@@ -2504,7 +2637,15 @@
               <w:jc w:val="both"/>
             </w:pPr>
             <w:r>
-              <w:t>PUT /api/admin/appointments/{id}/complete</w:t>
+              <w:t>PUT /</w:t>
+            </w:r>
+            <w:proofErr w:type="spellStart"/>
+            <w:r>
+              <w:t>api</w:t>
+            </w:r>
+            <w:proofErr w:type="spellEnd"/>
+            <w:r>
+              <w:t>/admin/appointments/{id}/complete</w:t>
             </w:r>
           </w:p>
         </w:tc>
@@ -2557,7 +2698,15 @@
               <w:jc w:val="both"/>
             </w:pPr>
             <w:r>
-              <w:t>PUT /api/admin/appointments/{id}/cancel</w:t>
+              <w:t>PUT /</w:t>
+            </w:r>
+            <w:proofErr w:type="spellStart"/>
+            <w:r>
+              <w:t>api</w:t>
+            </w:r>
+            <w:proofErr w:type="spellEnd"/>
+            <w:r>
+              <w:t>/admin/appointments/{id}/cancel</w:t>
             </w:r>
           </w:p>
         </w:tc>
@@ -2619,7 +2768,15 @@
               <w:jc w:val="both"/>
             </w:pPr>
             <w:r>
-              <w:t>Real-time SignalR hub</w:t>
+              <w:t xml:space="preserve">Real-time </w:t>
+            </w:r>
+            <w:proofErr w:type="spellStart"/>
+            <w:r>
+              <w:t>SignalR</w:t>
+            </w:r>
+            <w:proofErr w:type="spellEnd"/>
+            <w:r>
+              <w:t xml:space="preserve"> hub</w:t>
             </w:r>
           </w:p>
         </w:tc>
@@ -2690,6 +2847,9 @@
         <w:jc w:val="both"/>
       </w:pPr>
       <w:r>
+        <w:rPr>
+          <w:noProof/>
+        </w:rPr>
         <w:drawing>
           <wp:inline distT="0" distB="0" distL="0" distR="0" wp14:anchorId="301055CD" wp14:editId="5C16AE55">
             <wp:extent cx="5901267" cy="3273315"/>
@@ -2800,7 +2960,23 @@
         <w:jc w:val="both"/>
       </w:pPr>
       <w:r>
-        <w:t>Stores: username, email, full name, bcrypt-hashed password, role (enum: User=1, Admin=2), optional profile image path, and UTC creation timestamp</w:t>
+        <w:t xml:space="preserve">Stores: username, email, full name, </w:t>
+      </w:r>
+      <w:proofErr w:type="spellStart"/>
+      <w:r>
+        <w:t>bcrypt</w:t>
+      </w:r>
+      <w:proofErr w:type="spellEnd"/>
+      <w:r>
+        <w:t>-hashed password, role (</w:t>
+      </w:r>
+      <w:proofErr w:type="spellStart"/>
+      <w:r>
+        <w:t>enum</w:t>
+      </w:r>
+      <w:proofErr w:type="spellEnd"/>
+      <w:r>
+        <w:t>: User=1, Admin=2), optional profile image path, and UTC creation timestamp</w:t>
       </w:r>
     </w:p>
     <w:p>
@@ -2852,8 +3028,21 @@
         <w:jc w:val="both"/>
       </w:pPr>
       <w:r>
-        <w:t>Foreign Key: SpecializationId → Specializations.Id</w:t>
-      </w:r>
+        <w:t>Foreign Key: </w:t>
+      </w:r>
+      <w:proofErr w:type="spellStart"/>
+      <w:r>
+        <w:t>SpecializationId</w:t>
+      </w:r>
+      <w:proofErr w:type="spellEnd"/>
+      <w:r>
+        <w:t xml:space="preserve"> → </w:t>
+      </w:r>
+      <w:proofErr w:type="spellStart"/>
+      <w:r>
+        <w:t>Specializations.Id</w:t>
+      </w:r>
+      <w:proofErr w:type="spellEnd"/>
     </w:p>
     <w:p>
       <w:pPr>
@@ -2864,7 +3053,15 @@
         <w:jc w:val="both"/>
       </w:pPr>
       <w:r>
-        <w:t>Stores: full name, city, computed average rating, optional profile image, and an IsActive flag for soft-deactivation</w:t>
+        <w:t>Stores: full name, city, computed average rating, optional profile image, and an </w:t>
+      </w:r>
+      <w:proofErr w:type="spellStart"/>
+      <w:r>
+        <w:t>IsActive</w:t>
+      </w:r>
+      <w:proofErr w:type="spellEnd"/>
+      <w:r>
+        <w:t> flag for soft-deactivation</w:t>
       </w:r>
     </w:p>
     <w:p>
@@ -2960,8 +3157,37 @@
         <w:jc w:val="both"/>
       </w:pPr>
       <w:r>
-        <w:t>Foreign Keys: UserId → Users.Id; DoctorId → Doctors.Id</w:t>
-      </w:r>
+        <w:t>Foreign Keys: </w:t>
+      </w:r>
+      <w:proofErr w:type="spellStart"/>
+      <w:r>
+        <w:t>UserId</w:t>
+      </w:r>
+      <w:proofErr w:type="spellEnd"/>
+      <w:r>
+        <w:t xml:space="preserve"> → </w:t>
+      </w:r>
+      <w:proofErr w:type="spellStart"/>
+      <w:r>
+        <w:t>Users.Id</w:t>
+      </w:r>
+      <w:proofErr w:type="spellEnd"/>
+      <w:r>
+        <w:t>; </w:t>
+      </w:r>
+      <w:proofErr w:type="spellStart"/>
+      <w:r>
+        <w:t>DoctorId</w:t>
+      </w:r>
+      <w:proofErr w:type="spellEnd"/>
+      <w:r>
+        <w:t xml:space="preserve"> → </w:t>
+      </w:r>
+      <w:proofErr w:type="spellStart"/>
+      <w:r>
+        <w:t>Doctors.Id</w:t>
+      </w:r>
+      <w:proofErr w:type="spellEnd"/>
     </w:p>
     <w:p>
       <w:pPr>
@@ -2972,7 +3198,23 @@
         <w:jc w:val="both"/>
       </w:pPr>
       <w:r>
-        <w:t>Stores: appointment date (DateOnly), time slot string (e.g., "10:00–10:30"), status enum (Booked=1/Approved=2/Completed=3/Cancelled=4), created and cancelled timestamps</w:t>
+        <w:t>Stores: appointment date (</w:t>
+      </w:r>
+      <w:proofErr w:type="spellStart"/>
+      <w:r>
+        <w:t>DateOnly</w:t>
+      </w:r>
+      <w:proofErr w:type="spellEnd"/>
+      <w:r>
+        <w:t xml:space="preserve">), time slot string (e.g., "10:00–10:30"), status </w:t>
+      </w:r>
+      <w:proofErr w:type="spellStart"/>
+      <w:r>
+        <w:t>enum</w:t>
+      </w:r>
+      <w:proofErr w:type="spellEnd"/>
+      <w:r>
+        <w:t xml:space="preserve"> (Booked=1/Approved=2/Completed=3/Cancelled=4), created and cancelled timestamps</w:t>
       </w:r>
     </w:p>
     <w:p>
@@ -3008,8 +3250,37 @@
         <w:jc w:val="both"/>
       </w:pPr>
       <w:r>
-        <w:t>Foreign Keys: UserId → Users.Id; DoctorId → Doctors.Id</w:t>
-      </w:r>
+        <w:t>Foreign Keys: </w:t>
+      </w:r>
+      <w:proofErr w:type="spellStart"/>
+      <w:r>
+        <w:t>UserId</w:t>
+      </w:r>
+      <w:proofErr w:type="spellEnd"/>
+      <w:r>
+        <w:t xml:space="preserve"> → </w:t>
+      </w:r>
+      <w:proofErr w:type="spellStart"/>
+      <w:r>
+        <w:t>Users.Id</w:t>
+      </w:r>
+      <w:proofErr w:type="spellEnd"/>
+      <w:r>
+        <w:t>; </w:t>
+      </w:r>
+      <w:proofErr w:type="spellStart"/>
+      <w:r>
+        <w:t>DoctorId</w:t>
+      </w:r>
+      <w:proofErr w:type="spellEnd"/>
+      <w:r>
+        <w:t xml:space="preserve"> → </w:t>
+      </w:r>
+      <w:proofErr w:type="spellStart"/>
+      <w:r>
+        <w:t>Doctors.Id</w:t>
+      </w:r>
+      <w:proofErr w:type="spellEnd"/>
     </w:p>
     <w:p>
       <w:pPr>
@@ -3054,21 +3325,7 @@
           <w:bCs/>
         </w:rPr>
         <w:lastRenderedPageBreak/>
-        <w:t xml:space="preserve">Code </w:t>
-      </w:r>
-      <w:r>
-        <w:rPr>
-          <w:b/>
-          <w:bCs/>
-        </w:rPr>
-        <w:t>-</w:t>
-      </w:r>
-      <w:r>
-        <w:rPr>
-          <w:b/>
-          <w:bCs/>
-        </w:rPr>
-        <w:t xml:space="preserve"> Entity Models</w:t>
+        <w:t>Code - Entity Models</w:t>
       </w:r>
     </w:p>
     <w:p>
@@ -3084,6 +3341,9 @@
         <w:jc w:val="both"/>
       </w:pPr>
       <w:r>
+        <w:rPr>
+          <w:noProof/>
+        </w:rPr>
         <w:drawing>
           <wp:inline distT="0" distB="0" distL="0" distR="0" wp14:anchorId="24B53C14" wp14:editId="2F89E7CF">
             <wp:extent cx="4194385" cy="3623733"/>
@@ -3139,6 +3399,9 @@
         <w:jc w:val="both"/>
       </w:pPr>
       <w:r>
+        <w:rPr>
+          <w:noProof/>
+        </w:rPr>
         <w:drawing>
           <wp:inline distT="0" distB="0" distL="0" distR="0" wp14:anchorId="5FBD4906" wp14:editId="2D8F5E11">
             <wp:extent cx="5386553" cy="3572934"/>
@@ -3193,6 +3456,9 @@
         <w:jc w:val="both"/>
       </w:pPr>
       <w:r>
+        <w:rPr>
+          <w:noProof/>
+        </w:rPr>
         <w:drawing>
           <wp:inline distT="0" distB="0" distL="0" distR="0" wp14:anchorId="1C788D19" wp14:editId="43095301">
             <wp:extent cx="5731510" cy="4131945"/>
@@ -3265,7 +3531,23 @@
           <w:b/>
           <w:bCs/>
         </w:rPr>
-        <w:t>Database Seeding (Program.cs)</w:t>
+        <w:t>Database Seeding (</w:t>
+      </w:r>
+      <w:proofErr w:type="spellStart"/>
+      <w:r>
+        <w:rPr>
+          <w:b/>
+          <w:bCs/>
+        </w:rPr>
+        <w:t>Program.cs</w:t>
+      </w:r>
+      <w:proofErr w:type="spellEnd"/>
+      <w:r>
+        <w:rPr>
+          <w:b/>
+          <w:bCs/>
+        </w:rPr>
+        <w:t>)</w:t>
       </w:r>
     </w:p>
     <w:p>
@@ -3292,8 +3574,13 @@
         <w:t>Default Admin</w:t>
       </w:r>
       <w:r>
-        <w:t>: username nikhil11012, email nikhil11012@gmail.com, password hashed using ASP.NET Identity PasswordHasher</w:t>
-      </w:r>
+        <w:t>: username nikhil11012, email nikhil11012@gmail.com, password hashed using ASP.NET Identity </w:t>
+      </w:r>
+      <w:proofErr w:type="spellStart"/>
+      <w:r>
+        <w:t>PasswordHasher</w:t>
+      </w:r>
+      <w:proofErr w:type="spellEnd"/>
     </w:p>
     <w:p>
       <w:pPr>
@@ -3311,8 +3598,13 @@
         <w:t>Specializations</w:t>
       </w:r>
       <w:r>
-        <w:t>: Cardiologist, Dermatologist, Neurologist, Orthopedic</w:t>
-      </w:r>
+        <w:t xml:space="preserve">: Cardiologist, Dermatologist, Neurologist, </w:t>
+      </w:r>
+      <w:proofErr w:type="spellStart"/>
+      <w:r>
+        <w:t>Orthopedic</w:t>
+      </w:r>
+      <w:proofErr w:type="spellEnd"/>
       <w:r>
         <w:t xml:space="preserve"> etc.</w:t>
       </w:r>
@@ -3371,8 +3663,18 @@
         </w:numPr>
         <w:jc w:val="both"/>
       </w:pPr>
-      <w:r>
-        <w:t>AsNoTracking() is used on all read-only queries to avoid EF Core change tracking overhead.</w:t>
+      <w:proofErr w:type="spellStart"/>
+      <w:proofErr w:type="gramStart"/>
+      <w:r>
+        <w:t>AsNoTracking</w:t>
+      </w:r>
+      <w:proofErr w:type="spellEnd"/>
+      <w:r>
+        <w:t>(</w:t>
+      </w:r>
+      <w:proofErr w:type="gramEnd"/>
+      <w:r>
+        <w:t>) is used on all read-only queries to avoid EF Core change tracking overhead.</w:t>
       </w:r>
     </w:p>
     <w:p>
@@ -3384,7 +3686,57 @@
         <w:jc w:val="both"/>
       </w:pPr>
       <w:r>
-        <w:t>Selective column projections (.Select(u =&gt; new { u.Id, u.Username, ... })) avoid fetching the PasswordHash column in admin user listings.</w:t>
+        <w:t xml:space="preserve">Selective column projections </w:t>
+      </w:r>
+      <w:proofErr w:type="gramStart"/>
+      <w:r>
+        <w:t>(.Select</w:t>
+      </w:r>
+      <w:proofErr w:type="gramEnd"/>
+      <w:r>
+        <w:t xml:space="preserve">(u =&gt; new </w:t>
+      </w:r>
+      <w:proofErr w:type="gramStart"/>
+      <w:r>
+        <w:t xml:space="preserve">{ </w:t>
+      </w:r>
+      <w:proofErr w:type="spellStart"/>
+      <w:r>
+        <w:t>u</w:t>
+      </w:r>
+      <w:proofErr w:type="gramEnd"/>
+      <w:r>
+        <w:t>.Id</w:t>
+      </w:r>
+      <w:proofErr w:type="spellEnd"/>
+      <w:r>
+        <w:t xml:space="preserve">, </w:t>
+      </w:r>
+      <w:proofErr w:type="spellStart"/>
+      <w:proofErr w:type="gramStart"/>
+      <w:r>
+        <w:t>u.Username</w:t>
+      </w:r>
+      <w:proofErr w:type="spellEnd"/>
+      <w:proofErr w:type="gramEnd"/>
+      <w:r>
+        <w:t xml:space="preserve">, </w:t>
+      </w:r>
+      <w:proofErr w:type="gramStart"/>
+      <w:r>
+        <w:t>... }</w:t>
+      </w:r>
+      <w:proofErr w:type="gramEnd"/>
+      <w:r>
+        <w:t>)) avoid fetching the </w:t>
+      </w:r>
+      <w:proofErr w:type="spellStart"/>
+      <w:r>
+        <w:t>PasswordHash</w:t>
+      </w:r>
+      <w:proofErr w:type="spellEnd"/>
+      <w:r>
+        <w:t> column in admin user listings.</w:t>
       </w:r>
     </w:p>
     <w:p>
@@ -3408,8 +3760,18 @@
         </w:numPr>
         <w:jc w:val="both"/>
       </w:pPr>
-      <w:r>
-        <w:t>AnyAsync() is used for existence checks (duplicate username/email, slot conflict) instead of fetching full entities.</w:t>
+      <w:proofErr w:type="spellStart"/>
+      <w:proofErr w:type="gramStart"/>
+      <w:r>
+        <w:t>AnyAsync</w:t>
+      </w:r>
+      <w:proofErr w:type="spellEnd"/>
+      <w:r>
+        <w:t>(</w:t>
+      </w:r>
+      <w:proofErr w:type="gramEnd"/>
+      <w:r>
+        <w:t>) is used for existence checks (duplicate username/email, slot conflict) instead of fetching full entities.</w:t>
       </w:r>
     </w:p>
     <w:p>
@@ -3459,13 +3821,37 @@
         <w:t xml:space="preserve"> </w:t>
       </w:r>
       <w:r>
-        <w:t>same /api/auth/login endpoint. The difference is in the JWT token</w:t>
+        <w:t>same /</w:t>
+      </w:r>
+      <w:proofErr w:type="spellStart"/>
+      <w:r>
+        <w:t>api</w:t>
+      </w:r>
+      <w:proofErr w:type="spellEnd"/>
+      <w:r>
+        <w:t>/auth/login endpoint. The difference is in the JWT token</w:t>
       </w:r>
       <w:r>
         <w:t>.</w:t>
       </w:r>
       <w:r>
-        <w:t xml:space="preserve"> when an admin logs in, their token contains ClaimTypes.Role = "Admin". All admin controllers are decorated with [Authorize(Roles = "Admin")], so the backend enforces role-based access automatically.</w:t>
+        <w:t xml:space="preserve"> when an admin logs in, their token contains </w:t>
+      </w:r>
+      <w:proofErr w:type="spellStart"/>
+      <w:r>
+        <w:t>ClaimTypes.Role</w:t>
+      </w:r>
+      <w:proofErr w:type="spellEnd"/>
+      <w:r>
+        <w:t xml:space="preserve"> = "Admin". All admin controllers are decorated with [</w:t>
+      </w:r>
+      <w:proofErr w:type="gramStart"/>
+      <w:r>
+        <w:t>Authorize(</w:t>
+      </w:r>
+      <w:proofErr w:type="gramEnd"/>
+      <w:r>
+        <w:t>Roles = "Admin")], so the backend enforces role-based access automatically.</w:t>
       </w:r>
     </w:p>
     <w:p>
@@ -3478,15 +3864,23 @@
       <w:r>
         <w:t xml:space="preserve">- </w:t>
       </w:r>
-      <w:r>
-        <w:t>AuthController (Login &amp; Register)</w:t>
-      </w:r>
-    </w:p>
-    <w:p>
-      <w:pPr>
-        <w:jc w:val="both"/>
-      </w:pPr>
-      <w:r>
+      <w:proofErr w:type="spellStart"/>
+      <w:r>
+        <w:t>AuthController</w:t>
+      </w:r>
+      <w:proofErr w:type="spellEnd"/>
+      <w:r>
+        <w:t xml:space="preserve"> (Login &amp; Register)</w:t>
+      </w:r>
+    </w:p>
+    <w:p>
+      <w:pPr>
+        <w:jc w:val="both"/>
+      </w:pPr>
+      <w:r>
+        <w:rPr>
+          <w:noProof/>
+        </w:rPr>
         <w:drawing>
           <wp:inline distT="0" distB="0" distL="0" distR="0" wp14:anchorId="2B2EF3C1" wp14:editId="19B0FB36">
             <wp:extent cx="4343400" cy="5167712"/>
@@ -3539,7 +3933,15 @@
         <w:t>Explanation:</w:t>
       </w:r>
       <w:r>
-        <w:t> The login method accepts either a username or email as the identifier, trims whitespace, checks if the user exists, then uses ASP.NET Identity's PasswordHasher.VerifyHashedPassword() to safely compare the hashed password</w:t>
+        <w:t> The login method accepts either a username or email as the identifier, trims whitespace, checks if the user exists, then uses ASP.NET Identity's </w:t>
+      </w:r>
+      <w:proofErr w:type="spellStart"/>
+      <w:r>
+        <w:t>PasswordHasher.VerifyHashedPassword</w:t>
+      </w:r>
+      <w:proofErr w:type="spellEnd"/>
+      <w:r>
+        <w:t>() to safely compare the hashed password</w:t>
       </w:r>
       <w:r>
         <w:t xml:space="preserve">, </w:t>
@@ -3569,6 +3971,9 @@
         <w:jc w:val="both"/>
       </w:pPr>
       <w:r>
+        <w:rPr>
+          <w:noProof/>
+        </w:rPr>
         <w:drawing>
           <wp:inline distT="0" distB="0" distL="0" distR="0" wp14:anchorId="612D6850" wp14:editId="654E00EC">
             <wp:extent cx="5982648" cy="3852333"/>
@@ -3657,7 +4062,39 @@
         <w:jc w:val="both"/>
       </w:pPr>
       <w:r>
-        <w:t>User submits { username, email, fullName, password } to POST /api/auth/register</w:t>
+        <w:t>User submits </w:t>
+      </w:r>
+      <w:proofErr w:type="gramStart"/>
+      <w:r>
+        <w:t>{ username</w:t>
+      </w:r>
+      <w:proofErr w:type="gramEnd"/>
+      <w:r>
+        <w:t xml:space="preserve">, email, </w:t>
+      </w:r>
+      <w:proofErr w:type="spellStart"/>
+      <w:r>
+        <w:t>fullName</w:t>
+      </w:r>
+      <w:proofErr w:type="spellEnd"/>
+      <w:r>
+        <w:t xml:space="preserve">, </w:t>
+      </w:r>
+      <w:proofErr w:type="gramStart"/>
+      <w:r>
+        <w:t>password }</w:t>
+      </w:r>
+      <w:proofErr w:type="gramEnd"/>
+      <w:r>
+        <w:t> to POST /</w:t>
+      </w:r>
+      <w:proofErr w:type="spellStart"/>
+      <w:r>
+        <w:t>api</w:t>
+      </w:r>
+      <w:proofErr w:type="spellEnd"/>
+      <w:r>
+        <w:t>/auth/register</w:t>
       </w:r>
     </w:p>
     <w:p>
@@ -3681,7 +4118,23 @@
         <w:jc w:val="both"/>
       </w:pPr>
       <w:r>
-        <w:t>Password is hashed using IPasswordHasher&lt;User&gt; (BCrypt-based, salted)</w:t>
+        <w:t>Password is hashed using </w:t>
+      </w:r>
+      <w:proofErr w:type="spellStart"/>
+      <w:r>
+        <w:t>IPasswordHasher</w:t>
+      </w:r>
+      <w:proofErr w:type="spellEnd"/>
+      <w:r>
+        <w:t>&lt;User&gt; (</w:t>
+      </w:r>
+      <w:proofErr w:type="spellStart"/>
+      <w:r>
+        <w:t>BCrypt</w:t>
+      </w:r>
+      <w:proofErr w:type="spellEnd"/>
+      <w:r>
+        <w:t>-based, salted)</w:t>
       </w:r>
     </w:p>
     <w:p>
@@ -3693,8 +4146,13 @@
         <w:jc w:val="both"/>
       </w:pPr>
       <w:r>
-        <w:t>User is saved to the database with Role = UserRole.User</w:t>
-      </w:r>
+        <w:t xml:space="preserve">User is saved to the database with Role = </w:t>
+      </w:r>
+      <w:proofErr w:type="spellStart"/>
+      <w:r>
+        <w:t>UserRole.User</w:t>
+      </w:r>
+      <w:proofErr w:type="spellEnd"/>
     </w:p>
     <w:p>
       <w:pPr>
@@ -3720,18 +4178,27 @@
           <w:lang w:val="en-US"/>
         </w:rPr>
         <w:lastRenderedPageBreak/>
-        <w:t>Code – Register  Endpoint</w:t>
-      </w:r>
-    </w:p>
-    <w:p>
-      <w:pPr>
-        <w:jc w:val="both"/>
+        <w:t xml:space="preserve">Code – </w:t>
+      </w:r>
+      <w:proofErr w:type="gramStart"/>
+      <w:r>
         <w:rPr>
           <w:lang w:val="en-US"/>
         </w:rPr>
-      </w:pPr>
-      <w:r>
-        <w:rPr>
+        <w:t>Register  Endpoint</w:t>
+      </w:r>
+      <w:proofErr w:type="gramEnd"/>
+    </w:p>
+    <w:p>
+      <w:pPr>
+        <w:jc w:val="both"/>
+        <w:rPr>
+          <w:lang w:val="en-US"/>
+        </w:rPr>
+      </w:pPr>
+      <w:r>
+        <w:rPr>
+          <w:noProof/>
           <w:lang w:val="en-US"/>
         </w:rPr>
         <w:drawing>
@@ -3804,6 +4271,7 @@
       </w:pPr>
       <w:r>
         <w:rPr>
+          <w:noProof/>
           <w:lang w:val="en-US"/>
         </w:rPr>
         <w:drawing>
@@ -3865,7 +4333,15 @@
         <w:t>Explanation:</w:t>
       </w:r>
       <w:r>
-        <w:t> The JWT contains four claims: the user's database ID (used to look up ownership for appointments/ratings), full name, email, and role. The role claim is what ASP.NET Core uses to enforce [Authorize(Roles = "Admin")] on protected endpoints. The token is signed with HMAC-SHA256, making it tamper-evident.</w:t>
+        <w:t> The JWT contains four claims: the user's database ID (used to look up ownership for appointments/ratings), full name, email, and role. The role claim is what ASP.NET Core uses to enforce [</w:t>
+      </w:r>
+      <w:proofErr w:type="gramStart"/>
+      <w:r>
+        <w:t>Authorize(</w:t>
+      </w:r>
+      <w:proofErr w:type="gramEnd"/>
+      <w:r>
+        <w:t>Roles = "Admin")] on protected endpoints. The token is signed with HMAC-SHA256, making it tamper-evident.</w:t>
       </w:r>
     </w:p>
     <w:p>
@@ -3960,6 +4436,7 @@
       </w:pPr>
       <w:r>
         <w:rPr>
+          <w:noProof/>
           <w:lang w:val="en-US"/>
         </w:rPr>
         <w:drawing>
@@ -4029,7 +4506,20 @@
       </w:pPr>
       <w:r>
         <w:lastRenderedPageBreak/>
-        <w:t>Core Routing (app.routes.ts)</w:t>
+        <w:t>Core Routing (</w:t>
+      </w:r>
+      <w:proofErr w:type="spellStart"/>
+      <w:proofErr w:type="gramStart"/>
+      <w:r>
+        <w:t>app.routes</w:t>
+      </w:r>
+      <w:proofErr w:type="gramEnd"/>
+      <w:r>
+        <w:t>.ts</w:t>
+      </w:r>
+      <w:proofErr w:type="spellEnd"/>
+      <w:r>
+        <w:t>)</w:t>
       </w:r>
     </w:p>
     <w:p>
@@ -4041,6 +4531,7 @@
       </w:pPr>
       <w:r>
         <w:rPr>
+          <w:noProof/>
           <w:lang w:val="en-US"/>
         </w:rPr>
         <w:drawing>
@@ -4109,7 +4600,28 @@
         <w:t>Explanation:</w:t>
       </w:r>
       <w:r>
-        <w:t> All routes use Angular's loadComponent() for </w:t>
+        <w:t xml:space="preserve"> All routes use </w:t>
+      </w:r>
+      <w:proofErr w:type="spellStart"/>
+      <w:r>
+        <w:t>Angular's</w:t>
+      </w:r>
+      <w:proofErr w:type="spellEnd"/>
+      <w:r>
+        <w:t> </w:t>
+      </w:r>
+      <w:proofErr w:type="spellStart"/>
+      <w:proofErr w:type="gramStart"/>
+      <w:r>
+        <w:t>loadComponent</w:t>
+      </w:r>
+      <w:proofErr w:type="spellEnd"/>
+      <w:r>
+        <w:t>(</w:t>
+      </w:r>
+      <w:proofErr w:type="gramEnd"/>
+      <w:r>
+        <w:t>) for </w:t>
       </w:r>
       <w:r>
         <w:rPr>
@@ -4144,7 +4656,15 @@
         <w:jc w:val="both"/>
       </w:pPr>
       <w:r>
-        <w:t>App Config (app.config.ts)</w:t>
+        <w:t>App Config (</w:t>
+      </w:r>
+      <w:proofErr w:type="spellStart"/>
+      <w:r>
+        <w:t>app.config.ts</w:t>
+      </w:r>
+      <w:proofErr w:type="spellEnd"/>
+      <w:r>
+        <w:t>)</w:t>
       </w:r>
     </w:p>
     <w:p>
@@ -4167,6 +4687,7 @@
       </w:pPr>
       <w:r>
         <w:rPr>
+          <w:noProof/>
           <w:lang w:val="en-US"/>
         </w:rPr>
         <w:drawing>
@@ -4241,25 +4762,7 @@
           <w:szCs w:val="28"/>
         </w:rPr>
         <w:lastRenderedPageBreak/>
-        <w:t xml:space="preserve">7. Code Sanitization </w:t>
-      </w:r>
-      <w:r>
-        <w:rPr>
-          <w:b/>
-          <w:bCs/>
-          <w:sz w:val="28"/>
-          <w:szCs w:val="28"/>
-        </w:rPr>
-        <w:t xml:space="preserve">- </w:t>
-      </w:r>
-      <w:r>
-        <w:rPr>
-          <w:b/>
-          <w:bCs/>
-          <w:sz w:val="28"/>
-          <w:szCs w:val="28"/>
-        </w:rPr>
-        <w:t>Components, Services &amp; Modules</w:t>
+        <w:t>7. Code Sanitization - Components, Services &amp; Modules</w:t>
       </w:r>
     </w:p>
     <w:p>
@@ -4289,7 +4792,15 @@
         <w:jc w:val="both"/>
       </w:pPr>
       <w:r>
-        <w:t>The project follows Angular's recommended </w:t>
+        <w:t xml:space="preserve">The project follows </w:t>
+      </w:r>
+      <w:proofErr w:type="spellStart"/>
+      <w:r>
+        <w:t>Angular's</w:t>
+      </w:r>
+      <w:proofErr w:type="spellEnd"/>
+      <w:r>
+        <w:t xml:space="preserve"> recommended </w:t>
       </w:r>
       <w:r>
         <w:rPr>
@@ -4365,7 +4876,15 @@
         <w:t>Standalone Components</w:t>
       </w:r>
       <w:r>
-        <w:t> — Angular 18's standalone API is used throughout; there are no NgModule declarations. Each component declares its own imports in the @Component decorator.</w:t>
+        <w:t> — Angular 18's standalone API is used throughout; there are no </w:t>
+      </w:r>
+      <w:proofErr w:type="spellStart"/>
+      <w:r>
+        <w:t>NgModule</w:t>
+      </w:r>
+      <w:proofErr w:type="spellEnd"/>
+      <w:r>
+        <w:t> declarations. Each component declares its own imports in the @Component decorator.</w:t>
       </w:r>
     </w:p>
     <w:p>
@@ -4477,9 +4996,11 @@
               <w:spacing w:after="160" w:line="278" w:lineRule="auto"/>
               <w:jc w:val="both"/>
             </w:pPr>
+            <w:proofErr w:type="spellStart"/>
             <w:r>
               <w:t>AuthService</w:t>
             </w:r>
+            <w:proofErr w:type="spellEnd"/>
           </w:p>
         </w:tc>
         <w:tc>
@@ -4518,9 +5039,11 @@
               <w:spacing w:after="160" w:line="278" w:lineRule="auto"/>
               <w:jc w:val="both"/>
             </w:pPr>
+            <w:proofErr w:type="spellStart"/>
             <w:r>
               <w:t>AdminService</w:t>
             </w:r>
+            <w:proofErr w:type="spellEnd"/>
           </w:p>
         </w:tc>
         <w:tc>
@@ -4559,9 +5082,11 @@
               <w:spacing w:after="160" w:line="278" w:lineRule="auto"/>
               <w:jc w:val="both"/>
             </w:pPr>
+            <w:proofErr w:type="spellStart"/>
             <w:r>
               <w:t>AppointmentService</w:t>
             </w:r>
+            <w:proofErr w:type="spellEnd"/>
           </w:p>
         </w:tc>
         <w:tc>
@@ -4600,9 +5125,11 @@
               <w:spacing w:after="160" w:line="278" w:lineRule="auto"/>
               <w:jc w:val="both"/>
             </w:pPr>
+            <w:proofErr w:type="spellStart"/>
             <w:r>
               <w:t>DoctorService</w:t>
             </w:r>
+            <w:proofErr w:type="spellEnd"/>
           </w:p>
         </w:tc>
         <w:tc>
@@ -4641,9 +5168,11 @@
               <w:spacing w:after="160" w:line="278" w:lineRule="auto"/>
               <w:jc w:val="both"/>
             </w:pPr>
+            <w:proofErr w:type="spellStart"/>
             <w:r>
               <w:t>RatingService</w:t>
             </w:r>
+            <w:proofErr w:type="spellEnd"/>
           </w:p>
         </w:tc>
         <w:tc>
@@ -4682,9 +5211,11 @@
               <w:spacing w:after="160" w:line="278" w:lineRule="auto"/>
               <w:jc w:val="both"/>
             </w:pPr>
+            <w:proofErr w:type="spellStart"/>
             <w:r>
               <w:t>NotificationService</w:t>
             </w:r>
+            <w:proofErr w:type="spellEnd"/>
           </w:p>
         </w:tc>
         <w:tc>
@@ -4701,7 +5232,15 @@
               <w:jc w:val="both"/>
             </w:pPr>
             <w:r>
-              <w:t>Manage the SignalR WebSocket connection and notification state</w:t>
+              <w:t xml:space="preserve">Manage the </w:t>
+            </w:r>
+            <w:proofErr w:type="spellStart"/>
+            <w:r>
+              <w:t>SignalR</w:t>
+            </w:r>
+            <w:proofErr w:type="spellEnd"/>
+            <w:r>
+              <w:t xml:space="preserve"> WebSocket connection and notification state</w:t>
             </w:r>
           </w:p>
         </w:tc>
@@ -4742,13 +5281,29 @@
         <w:jc w:val="both"/>
       </w:pPr>
       <w:r>
-        <w:t>All services are providedIn: 'root'</w:t>
+        <w:t>All services are </w:t>
+      </w:r>
+      <w:proofErr w:type="spellStart"/>
+      <w:r>
+        <w:t>providedIn</w:t>
+      </w:r>
+      <w:proofErr w:type="spellEnd"/>
+      <w:r>
+        <w:t>: 'root</w:t>
+      </w:r>
+      <w:proofErr w:type="gramStart"/>
+      <w:r>
+        <w:t>'</w:t>
       </w:r>
       <w:r>
         <w:t xml:space="preserve"> </w:t>
       </w:r>
       <w:r>
-        <w:t xml:space="preserve"> meaning they are application-wide singletons, created once and destroyed when the app closes.</w:t>
+        <w:t xml:space="preserve"> meaning</w:t>
+      </w:r>
+      <w:proofErr w:type="gramEnd"/>
+      <w:r>
+        <w:t xml:space="preserve"> they are application-wide singletons, created once and destroyed when the app closes.</w:t>
       </w:r>
     </w:p>
     <w:p>
@@ -4776,7 +5331,15 @@
       </w:pPr>
       <w:r>
         <w:lastRenderedPageBreak/>
-        <w:t>Guards (core/guards/auth.guard.ts)</w:t>
+        <w:t>Guards (core/guards/</w:t>
+      </w:r>
+      <w:proofErr w:type="spellStart"/>
+      <w:r>
+        <w:t>auth.guard.ts</w:t>
+      </w:r>
+      <w:proofErr w:type="spellEnd"/>
+      <w:r>
+        <w:t>)</w:t>
       </w:r>
     </w:p>
     <w:p>
@@ -4791,6 +5354,7 @@
       </w:pPr>
       <w:r>
         <w:rPr>
+          <w:noProof/>
           <w:lang w:val="en-US"/>
         </w:rPr>
         <w:drawing>
@@ -4858,7 +5422,31 @@
         <w:t>Explanation:</w:t>
       </w:r>
       <w:r>
-        <w:t> Two guards are defined in one file: authGuard blocks unauthenticated users from protected routes (like /my-appointments), while adminGuard additionally checks the user's role (stored in sessionStorage) before allowing access to /admin.</w:t>
+        <w:t> Two guards are defined in one file: </w:t>
+      </w:r>
+      <w:proofErr w:type="spellStart"/>
+      <w:r>
+        <w:t>authGuard</w:t>
+      </w:r>
+      <w:proofErr w:type="spellEnd"/>
+      <w:r>
+        <w:t> blocks unauthenticated users from protected routes (like /my-appointments), while </w:t>
+      </w:r>
+      <w:proofErr w:type="spellStart"/>
+      <w:r>
+        <w:t>adminGuard</w:t>
+      </w:r>
+      <w:proofErr w:type="spellEnd"/>
+      <w:r>
+        <w:t> additionally checks the user's role (stored in </w:t>
+      </w:r>
+      <w:proofErr w:type="spellStart"/>
+      <w:r>
+        <w:t>sessionStorage</w:t>
+      </w:r>
+      <w:proofErr w:type="spellEnd"/>
+      <w:r>
+        <w:t>) before allowing access to /admin.</w:t>
       </w:r>
     </w:p>
     <w:p>
@@ -4877,7 +5465,15 @@
         <w:jc w:val="both"/>
       </w:pPr>
       <w:r>
-        <w:t>Interceptor (core/interceptors/auth.interceptor.ts)</w:t>
+        <w:t>Interceptor (core/interceptors/</w:t>
+      </w:r>
+      <w:proofErr w:type="spellStart"/>
+      <w:r>
+        <w:t>auth.interceptor.ts</w:t>
+      </w:r>
+      <w:proofErr w:type="spellEnd"/>
+      <w:r>
+        <w:t>)</w:t>
       </w:r>
     </w:p>
     <w:p>
@@ -4896,6 +5492,9 @@
         <w:jc w:val="both"/>
       </w:pPr>
       <w:r>
+        <w:rPr>
+          <w:noProof/>
+        </w:rPr>
         <w:drawing>
           <wp:inline distT="0" distB="0" distL="0" distR="0" wp14:anchorId="06B479BC" wp14:editId="0FA6676E">
             <wp:extent cx="5012267" cy="2261239"/>
@@ -5017,6 +5616,9 @@
         <w:t>D)</w:t>
       </w:r>
       <w:r>
+        <w:rPr>
+          <w:noProof/>
+        </w:rPr>
         <w:drawing>
           <wp:inline distT="0" distB="0" distL="0" distR="0" wp14:anchorId="143F9DBF" wp14:editId="67936D3E">
             <wp:extent cx="4097867" cy="3365100"/>
@@ -5062,6 +5664,9 @@
         <w:jc w:val="both"/>
       </w:pPr>
       <w:r>
+        <w:rPr>
+          <w:noProof/>
+        </w:rPr>
         <w:drawing>
           <wp:inline distT="0" distB="0" distL="0" distR="0" wp14:anchorId="7F0513E5" wp14:editId="2D5B4309">
             <wp:extent cx="3970997" cy="3115733"/>
@@ -5127,6 +5732,9 @@
         <w:jc w:val="both"/>
       </w:pPr>
       <w:r>
+        <w:rPr>
+          <w:noProof/>
+        </w:rPr>
         <w:drawing>
           <wp:inline distT="0" distB="0" distL="0" distR="0" wp14:anchorId="440362B6" wp14:editId="474A624C">
             <wp:extent cx="5046963" cy="4597400"/>
@@ -5179,6 +5787,9 @@
         <w:jc w:val="both"/>
       </w:pPr>
       <w:r>
+        <w:rPr>
+          <w:noProof/>
+        </w:rPr>
         <w:drawing>
           <wp:inline distT="0" distB="0" distL="0" distR="0" wp14:anchorId="5DB7617A" wp14:editId="770441EA">
             <wp:extent cx="5731510" cy="3031490"/>
@@ -5235,6 +5846,9 @@
         <w:jc w:val="both"/>
       </w:pPr>
       <w:r>
+        <w:rPr>
+          <w:noProof/>
+        </w:rPr>
         <w:drawing>
           <wp:inline distT="0" distB="0" distL="0" distR="0" wp14:anchorId="68FA358D" wp14:editId="7EDC3E27">
             <wp:extent cx="5731510" cy="3382645"/>
@@ -5282,6 +5896,9 @@
         <w:jc w:val="both"/>
       </w:pPr>
       <w:r>
+        <w:rPr>
+          <w:noProof/>
+        </w:rPr>
         <w:drawing>
           <wp:inline distT="0" distB="0" distL="0" distR="0" wp14:anchorId="0DE24D83" wp14:editId="3E1C94CC">
             <wp:extent cx="5731510" cy="3242310"/>
@@ -5348,6 +5965,9 @@
         <w:jc w:val="both"/>
       </w:pPr>
       <w:r>
+        <w:rPr>
+          <w:noProof/>
+        </w:rPr>
         <w:drawing>
           <wp:inline distT="0" distB="0" distL="0" distR="0" wp14:anchorId="7BCF201B" wp14:editId="654DF370">
             <wp:extent cx="5731510" cy="5255260"/>
@@ -5406,6 +6026,7 @@
         <w:rPr>
           <w:b/>
           <w:bCs/>
+          <w:noProof/>
         </w:rPr>
         <w:drawing>
           <wp:inline distT="0" distB="0" distL="0" distR="0" wp14:anchorId="307146F8" wp14:editId="1D1434D4">
@@ -5530,6 +6151,9 @@
         <w:jc w:val="both"/>
       </w:pPr>
       <w:r>
+        <w:rPr>
+          <w:noProof/>
+        </w:rPr>
         <w:drawing>
           <wp:inline distT="0" distB="0" distL="0" distR="0" wp14:anchorId="6F61FA9E" wp14:editId="125B1721">
             <wp:extent cx="5731510" cy="5433060"/>
@@ -5575,6 +6199,9 @@
         <w:jc w:val="both"/>
       </w:pPr>
       <w:r>
+        <w:rPr>
+          <w:noProof/>
+        </w:rPr>
         <w:drawing>
           <wp:inline distT="0" distB="0" distL="0" distR="0" wp14:anchorId="13D1079C" wp14:editId="16A26795">
             <wp:extent cx="5731510" cy="1561465"/>
@@ -5620,6 +6247,9 @@
         <w:jc w:val="both"/>
       </w:pPr>
       <w:r>
+        <w:rPr>
+          <w:noProof/>
+        </w:rPr>
         <w:lastRenderedPageBreak/>
         <w:drawing>
           <wp:inline distT="0" distB="0" distL="0" distR="0" wp14:anchorId="62D008A6" wp14:editId="09C0BB04">
@@ -5674,6 +6304,9 @@
         <w:jc w:val="both"/>
       </w:pPr>
       <w:r>
+        <w:rPr>
+          <w:noProof/>
+        </w:rPr>
         <w:drawing>
           <wp:inline distT="0" distB="0" distL="0" distR="0" wp14:anchorId="5FBA5EA8" wp14:editId="52A9F324">
             <wp:extent cx="4939404" cy="2675466"/>
@@ -5727,6 +6360,9 @@
         <w:jc w:val="both"/>
       </w:pPr>
       <w:r>
+        <w:rPr>
+          <w:noProof/>
+        </w:rPr>
         <w:drawing>
           <wp:inline distT="0" distB="0" distL="0" distR="0" wp14:anchorId="0AFF5CAE" wp14:editId="2690F702">
             <wp:extent cx="4834467" cy="2626124"/>
@@ -5783,8 +6419,9 @@
           <w:szCs w:val="28"/>
         </w:rPr>
         <w:lastRenderedPageBreak/>
-        <w:t>Feature 2</w:t>
-      </w:r>
+        <w:t xml:space="preserve">Feature </w:t>
+      </w:r>
+      <w:proofErr w:type="gramStart"/>
       <w:r>
         <w:rPr>
           <w:b/>
@@ -5792,7 +6429,7 @@
           <w:sz w:val="28"/>
           <w:szCs w:val="28"/>
         </w:rPr>
-        <w:t xml:space="preserve"> </w:t>
+        <w:t>2</w:t>
       </w:r>
       <w:r>
         <w:rPr>
@@ -5801,14 +6438,40 @@
           <w:sz w:val="28"/>
           <w:szCs w:val="28"/>
         </w:rPr>
+        <w:t xml:space="preserve"> </w:t>
+      </w:r>
+      <w:r>
+        <w:rPr>
+          <w:b/>
+          <w:bCs/>
+          <w:sz w:val="28"/>
+          <w:szCs w:val="28"/>
+        </w:rPr>
         <w:t>:</w:t>
       </w:r>
-      <w:r>
-        <w:rPr>
-          <w:b/>
-          <w:bCs/>
-        </w:rPr>
-        <w:t xml:space="preserve"> Real-Time SignalR Notifications</w:t>
+      <w:proofErr w:type="gramEnd"/>
+      <w:r>
+        <w:rPr>
+          <w:b/>
+          <w:bCs/>
+        </w:rPr>
+        <w:t xml:space="preserve"> Real-Time </w:t>
+      </w:r>
+      <w:proofErr w:type="spellStart"/>
+      <w:r>
+        <w:rPr>
+          <w:b/>
+          <w:bCs/>
+        </w:rPr>
+        <w:t>SignalR</w:t>
+      </w:r>
+      <w:proofErr w:type="spellEnd"/>
+      <w:r>
+        <w:rPr>
+          <w:b/>
+          <w:bCs/>
+        </w:rPr>
+        <w:t xml:space="preserve"> Notifications</w:t>
       </w:r>
     </w:p>
     <w:p>
@@ -5818,8 +6481,13 @@
         </w:tabs>
         <w:jc w:val="both"/>
       </w:pPr>
-      <w:r>
-        <w:t>SignalR provides a persistent WebSocket connection so users receive instant notifications without polling.</w:t>
+      <w:proofErr w:type="spellStart"/>
+      <w:r>
+        <w:t>SignalR</w:t>
+      </w:r>
+      <w:proofErr w:type="spellEnd"/>
+      <w:r>
+        <w:t xml:space="preserve"> provides a persistent WebSocket connection so users receive instant notifications without polling.</w:t>
       </w:r>
     </w:p>
     <w:p>
@@ -5834,7 +6502,23 @@
           <w:b/>
           <w:bCs/>
         </w:rPr>
-        <w:t>Backend Hub Configuration (Program.cs):</w:t>
+        <w:t>Backend Hub Configuration (</w:t>
+      </w:r>
+      <w:proofErr w:type="spellStart"/>
+      <w:r>
+        <w:rPr>
+          <w:b/>
+          <w:bCs/>
+        </w:rPr>
+        <w:t>Program.cs</w:t>
+      </w:r>
+      <w:proofErr w:type="spellEnd"/>
+      <w:r>
+        <w:rPr>
+          <w:b/>
+          <w:bCs/>
+        </w:rPr>
+        <w:t>):</w:t>
       </w:r>
     </w:p>
     <w:p>
@@ -5845,6 +6529,9 @@
         <w:jc w:val="both"/>
       </w:pPr>
       <w:r>
+        <w:rPr>
+          <w:noProof/>
+        </w:rPr>
         <w:drawing>
           <wp:inline distT="0" distB="0" distL="0" distR="0" wp14:anchorId="1C2D8D82" wp14:editId="3D13AB54">
             <wp:extent cx="5731510" cy="3285490"/>
@@ -5906,6 +6593,9 @@
         <w:jc w:val="both"/>
       </w:pPr>
       <w:r>
+        <w:rPr>
+          <w:noProof/>
+        </w:rPr>
         <w:drawing>
           <wp:inline distT="0" distB="0" distL="0" distR="0" wp14:anchorId="52B600EA" wp14:editId="6EBFE3B1">
             <wp:extent cx="5731510" cy="993775"/>
@@ -5975,6 +6665,9 @@
         <w:jc w:val="both"/>
       </w:pPr>
       <w:r>
+        <w:rPr>
+          <w:noProof/>
+        </w:rPr>
         <w:drawing>
           <wp:inline distT="0" distB="0" distL="0" distR="0" wp14:anchorId="1A4D942C" wp14:editId="34A9DF2C">
             <wp:extent cx="5731510" cy="979805"/>
@@ -6137,7 +6830,23 @@
               <w:jc w:val="both"/>
             </w:pPr>
             <w:r>
-              <w:t xml:space="preserve">"{PatientName} has booked an appointment with Dr. {DoctorName}. </w:t>
+              <w:t>"{</w:t>
+            </w:r>
+            <w:proofErr w:type="spellStart"/>
+            <w:r>
+              <w:t>PatientName</w:t>
+            </w:r>
+            <w:proofErr w:type="spellEnd"/>
+            <w:r>
+              <w:t>} has booked an appointment with Dr. {</w:t>
+            </w:r>
+            <w:proofErr w:type="spellStart"/>
+            <w:r>
+              <w:t>DoctorName</w:t>
+            </w:r>
+            <w:proofErr w:type="spellEnd"/>
+            <w:r>
+              <w:t xml:space="preserve">}. </w:t>
             </w:r>
             <w:r>
               <w:rPr>
@@ -6342,6 +7051,7 @@
         <w:rPr>
           <w:b/>
           <w:bCs/>
+          <w:noProof/>
         </w:rPr>
         <w:drawing>
           <wp:inline distT="0" distB="0" distL="0" distR="0" wp14:anchorId="2F99C6D6" wp14:editId="146354EE">
@@ -6405,6 +7115,7 @@
         <w:rPr>
           <w:b/>
           <w:bCs/>
+          <w:noProof/>
         </w:rPr>
         <w:drawing>
           <wp:inline distT="0" distB="0" distL="0" distR="0" wp14:anchorId="333AE655" wp14:editId="2E0C0370">
@@ -6493,7 +7204,23 @@
         <w:jc w:val="both"/>
       </w:pPr>
       <w:r>
-        <w:t>The app uses a responsive container pattern (max-w-7xl mx-auto px-4 sm:px-6 lg:px-8) so content has proper margins on all screens.</w:t>
+        <w:t xml:space="preserve">The app uses a responsive container pattern (max-w-7xl mx-auto px-4 </w:t>
+      </w:r>
+      <w:proofErr w:type="gramStart"/>
+      <w:r>
+        <w:t>sm:px</w:t>
+      </w:r>
+      <w:proofErr w:type="gramEnd"/>
+      <w:r>
+        <w:t xml:space="preserve">-6 </w:t>
+      </w:r>
+      <w:proofErr w:type="gramStart"/>
+      <w:r>
+        <w:t>lg:px</w:t>
+      </w:r>
+      <w:proofErr w:type="gramEnd"/>
+      <w:r>
+        <w:t>-8) so content has proper margins on all screens.</w:t>
       </w:r>
     </w:p>
     <w:p>
@@ -6543,7 +7270,17 @@
         <w:jc w:val="both"/>
       </w:pPr>
       <w:r>
-        <w:t>Desktop navigation is shown only on medium+ screens using hidden md:flex.</w:t>
+        <w:t xml:space="preserve">Desktop navigation is shown only on medium+ screens using hidden </w:t>
+      </w:r>
+      <w:proofErr w:type="spellStart"/>
+      <w:proofErr w:type="gramStart"/>
+      <w:r>
+        <w:t>md:flex</w:t>
+      </w:r>
+      <w:proofErr w:type="spellEnd"/>
+      <w:proofErr w:type="gramEnd"/>
+      <w:r>
+        <w:t>.</w:t>
       </w:r>
     </w:p>
     <w:p>
@@ -6555,7 +7292,15 @@
         <w:jc w:val="both"/>
       </w:pPr>
       <w:r>
-        <w:t>On mobile, the layout stays compact with flex alignment (flex justify-between items-center h-16) and spacing utilities (gap-*) so it doesn’t overflow.</w:t>
+        <w:t>On mobile, the layout stays compact with flex alignment (flex justify-between items-</w:t>
+      </w:r>
+      <w:proofErr w:type="spellStart"/>
+      <w:r>
+        <w:t>center</w:t>
+      </w:r>
+      <w:proofErr w:type="spellEnd"/>
+      <w:r>
+        <w:t xml:space="preserve"> h-16) and spacing utilities (gap-*) so it doesn’t overflow.</w:t>
       </w:r>
     </w:p>
     <w:p>
@@ -6583,7 +7328,15 @@
         <w:jc w:val="both"/>
       </w:pPr>
       <w:r>
-        <w:t>Search filters use a responsive grid: grid grid-cols-1 md:grid-cols-4, so filters stack in </w:t>
+        <w:t xml:space="preserve">Search filters use a responsive grid: grid grid-cols-1 </w:t>
+      </w:r>
+      <w:proofErr w:type="gramStart"/>
+      <w:r>
+        <w:t>md:grid</w:t>
+      </w:r>
+      <w:proofErr w:type="gramEnd"/>
+      <w:r>
+        <w:t>-cols-4, so filters stack in </w:t>
       </w:r>
       <w:r>
         <w:rPr>
@@ -6615,7 +7368,31 @@
         <w:jc w:val="both"/>
       </w:pPr>
       <w:r>
-        <w:t>Doctor listing uses responsive columns: grid grid-cols-1 md:grid-cols-2 lg:grid-cols-3 xl:grid-cols-4, scaling from </w:t>
+        <w:t xml:space="preserve">Doctor listing uses responsive columns: grid grid-cols-1 </w:t>
+      </w:r>
+      <w:proofErr w:type="gramStart"/>
+      <w:r>
+        <w:t>md:grid</w:t>
+      </w:r>
+      <w:proofErr w:type="gramEnd"/>
+      <w:r>
+        <w:t xml:space="preserve">-cols-2 </w:t>
+      </w:r>
+      <w:proofErr w:type="gramStart"/>
+      <w:r>
+        <w:t>lg:grid</w:t>
+      </w:r>
+      <w:proofErr w:type="gramEnd"/>
+      <w:r>
+        <w:t xml:space="preserve">-cols-3 </w:t>
+      </w:r>
+      <w:proofErr w:type="gramStart"/>
+      <w:r>
+        <w:t>xl:grid</w:t>
+      </w:r>
+      <w:proofErr w:type="gramEnd"/>
+      <w:r>
+        <w:t>-cols-4, scaling from </w:t>
       </w:r>
       <w:r>
         <w:rPr>
@@ -6665,7 +7442,20 @@
         <w:jc w:val="both"/>
       </w:pPr>
       <w:r>
-        <w:t>The main layout switches from stacked to split view using flex flex-col md:flex-row.</w:t>
+        <w:t xml:space="preserve">The main layout switches from stacked to split view using flex flex-col </w:t>
+      </w:r>
+      <w:proofErr w:type="spellStart"/>
+      <w:proofErr w:type="gramStart"/>
+      <w:r>
+        <w:t>md:flex</w:t>
+      </w:r>
+      <w:proofErr w:type="gramEnd"/>
+      <w:r>
+        <w:t>-row</w:t>
+      </w:r>
+      <w:proofErr w:type="spellEnd"/>
+      <w:r>
+        <w:t>.</w:t>
       </w:r>
     </w:p>
     <w:p>
@@ -6677,7 +7467,25 @@
         <w:jc w:val="both"/>
       </w:pPr>
       <w:r>
-        <w:t>The illustration section is hidden on small screens (hidden md:flex) to keep the login form centered and readable.</w:t>
+        <w:t xml:space="preserve">The illustration section is hidden on small screens (hidden </w:t>
+      </w:r>
+      <w:proofErr w:type="spellStart"/>
+      <w:proofErr w:type="gramStart"/>
+      <w:r>
+        <w:t>md:flex</w:t>
+      </w:r>
+      <w:proofErr w:type="spellEnd"/>
+      <w:proofErr w:type="gramEnd"/>
+      <w:r>
+        <w:t xml:space="preserve">) to keep the login form </w:t>
+      </w:r>
+      <w:proofErr w:type="spellStart"/>
+      <w:r>
+        <w:t>centered</w:t>
+      </w:r>
+      <w:proofErr w:type="spellEnd"/>
+      <w:r>
+        <w:t xml:space="preserve"> and readable.</w:t>
       </w:r>
     </w:p>
     <w:p>
@@ -6689,7 +7497,15 @@
         <w:jc w:val="both"/>
       </w:pPr>
       <w:r>
-        <w:t>The form container uses w-full md:w-1/2 max-w-md so it remains full width on mobile but doesn’t stretch too wide on desktop.</w:t>
+        <w:t xml:space="preserve">The form container uses w-full </w:t>
+      </w:r>
+      <w:proofErr w:type="gramStart"/>
+      <w:r>
+        <w:t>md:w</w:t>
+      </w:r>
+      <w:proofErr w:type="gramEnd"/>
+      <w:r>
+        <w:t>-1/2 max-w-md so it remains full width on mobile but doesn’t stretch too wide on desktop.</w:t>
       </w:r>
     </w:p>
     <w:p>
@@ -6717,7 +7533,30 @@
         <w:jc w:val="both"/>
       </w:pPr>
       <w:r>
-        <w:t>Same responsive pattern as Login: flex flex-col md:flex-row with the illustration hidden on mobile (hidden md:flex).</w:t>
+        <w:t xml:space="preserve">Same responsive pattern as Login: flex flex-col </w:t>
+      </w:r>
+      <w:proofErr w:type="spellStart"/>
+      <w:proofErr w:type="gramStart"/>
+      <w:r>
+        <w:t>md:flex</w:t>
+      </w:r>
+      <w:proofErr w:type="gramEnd"/>
+      <w:r>
+        <w:t>-row</w:t>
+      </w:r>
+      <w:proofErr w:type="spellEnd"/>
+      <w:r>
+        <w:t xml:space="preserve"> with the illustration hidden on mobile (hidden </w:t>
+      </w:r>
+      <w:proofErr w:type="spellStart"/>
+      <w:proofErr w:type="gramStart"/>
+      <w:r>
+        <w:t>md:flex</w:t>
+      </w:r>
+      <w:proofErr w:type="spellEnd"/>
+      <w:proofErr w:type="gramEnd"/>
+      <w:r>
+        <w:t>).</w:t>
       </w:r>
     </w:p>
     <w:p>
@@ -6729,7 +7568,31 @@
         <w:jc w:val="both"/>
       </w:pPr>
       <w:r>
-        <w:t>Form stays readable using w-full md:w-1/2 max-w-md and consistent spacing (space-y-6, px-4 sm:px-6 lg:px-8).</w:t>
+        <w:t xml:space="preserve">Form stays readable using w-full </w:t>
+      </w:r>
+      <w:proofErr w:type="gramStart"/>
+      <w:r>
+        <w:t>md:w</w:t>
+      </w:r>
+      <w:proofErr w:type="gramEnd"/>
+      <w:r>
+        <w:t xml:space="preserve">-1/2 max-w-md and consistent spacing (space-y-6, px-4 </w:t>
+      </w:r>
+      <w:proofErr w:type="gramStart"/>
+      <w:r>
+        <w:t>sm:px</w:t>
+      </w:r>
+      <w:proofErr w:type="gramEnd"/>
+      <w:r>
+        <w:t xml:space="preserve">-6 </w:t>
+      </w:r>
+      <w:proofErr w:type="gramStart"/>
+      <w:r>
+        <w:t>lg:px</w:t>
+      </w:r>
+      <w:proofErr w:type="gramEnd"/>
+      <w:r>
+        <w:t>-8).</w:t>
       </w:r>
     </w:p>
     <w:p>
@@ -6758,7 +7621,20 @@
         <w:jc w:val="both"/>
       </w:pPr>
       <w:r>
-        <w:t>Doctor details card uses flex flex-col md:flex-row so the image and info stack on mobile and align side</w:t>
+        <w:t xml:space="preserve">Doctor details card uses flex flex-col </w:t>
+      </w:r>
+      <w:proofErr w:type="spellStart"/>
+      <w:proofErr w:type="gramStart"/>
+      <w:r>
+        <w:t>md:flex</w:t>
+      </w:r>
+      <w:proofErr w:type="gramEnd"/>
+      <w:r>
+        <w:t>-row</w:t>
+      </w:r>
+      <w:proofErr w:type="spellEnd"/>
+      <w:r>
+        <w:t> so the image and info stack on mobile and align side</w:t>
       </w:r>
       <w:r>
         <w:noBreakHyphen/>
@@ -6778,7 +7654,23 @@
         <w:jc w:val="both"/>
       </w:pPr>
       <w:r>
-        <w:t>Booking time slots use a responsive grid: grid grid-cols-3 sm:grid-cols-4 md:grid-cols-5, increasing available columns as screen size grows.</w:t>
+        <w:t xml:space="preserve">Booking time slots use a responsive grid: grid grid-cols-3 </w:t>
+      </w:r>
+      <w:proofErr w:type="gramStart"/>
+      <w:r>
+        <w:t>sm:grid</w:t>
+      </w:r>
+      <w:proofErr w:type="gramEnd"/>
+      <w:r>
+        <w:t xml:space="preserve">-cols-4 </w:t>
+      </w:r>
+      <w:proofErr w:type="gramStart"/>
+      <w:r>
+        <w:t>md:grid</w:t>
+      </w:r>
+      <w:proofErr w:type="gramEnd"/>
+      <w:r>
+        <w:t>-cols-5, increasing available columns as screen size grows.</w:t>
       </w:r>
     </w:p>
     <w:p>
@@ -6806,7 +7698,31 @@
         <w:jc w:val="both"/>
       </w:pPr>
       <w:r>
-        <w:t>Uses a centered responsive container (max-w-md w-full) with padding utilities (px-4 sm:px-6 lg:px-8) to maintain consistent spacing across devices.</w:t>
+        <w:t xml:space="preserve">Uses a </w:t>
+      </w:r>
+      <w:proofErr w:type="spellStart"/>
+      <w:r>
+        <w:t>centered</w:t>
+      </w:r>
+      <w:proofErr w:type="spellEnd"/>
+      <w:r>
+        <w:t xml:space="preserve"> responsive container (max-w-md w-full) with padding utilities (px-4 </w:t>
+      </w:r>
+      <w:proofErr w:type="gramStart"/>
+      <w:r>
+        <w:t>sm:px</w:t>
+      </w:r>
+      <w:proofErr w:type="gramEnd"/>
+      <w:r>
+        <w:t xml:space="preserve">-6 </w:t>
+      </w:r>
+      <w:proofErr w:type="gramStart"/>
+      <w:r>
+        <w:t>lg:px</w:t>
+      </w:r>
+      <w:proofErr w:type="gramEnd"/>
+      <w:r>
+        <w:t>-8) to maintain consistent spacing across devices.</w:t>
       </w:r>
     </w:p>
     <w:p>
@@ -6846,7 +7762,23 @@
         <w:jc w:val="both"/>
       </w:pPr>
       <w:r>
-        <w:t>Appointment cards use responsive grid columns: grid grid-cols-1 md:grid-cols-2 lg:grid-cols-3, showing </w:t>
+        <w:t xml:space="preserve">Appointment cards use responsive grid columns: grid grid-cols-1 </w:t>
+      </w:r>
+      <w:proofErr w:type="gramStart"/>
+      <w:r>
+        <w:t>md:grid</w:t>
+      </w:r>
+      <w:proofErr w:type="gramEnd"/>
+      <w:r>
+        <w:t xml:space="preserve">-cols-2 </w:t>
+      </w:r>
+      <w:proofErr w:type="gramStart"/>
+      <w:r>
+        <w:t>lg:grid</w:t>
+      </w:r>
+      <w:proofErr w:type="gramEnd"/>
+      <w:r>
+        <w:t>-cols-3, showing </w:t>
       </w:r>
       <w:r>
         <w:rPr>
@@ -6908,7 +7840,23 @@
         <w:jc w:val="both"/>
       </w:pPr>
       <w:r>
-        <w:t>The “stats” tiles are responsive: grid grid-cols-1 md:grid-cols-2 lg:grid-cols-4.</w:t>
+        <w:t xml:space="preserve">The “stats” tiles are responsive: grid grid-cols-1 </w:t>
+      </w:r>
+      <w:proofErr w:type="gramStart"/>
+      <w:r>
+        <w:t>md:grid</w:t>
+      </w:r>
+      <w:proofErr w:type="gramEnd"/>
+      <w:r>
+        <w:t xml:space="preserve">-cols-2 </w:t>
+      </w:r>
+      <w:proofErr w:type="gramStart"/>
+      <w:r>
+        <w:t>lg:grid</w:t>
+      </w:r>
+      <w:proofErr w:type="gramEnd"/>
+      <w:r>
+        <w:t>-cols-4.</w:t>
       </w:r>
     </w:p>
     <w:p>
@@ -6948,7 +7896,23 @@
         <w:jc w:val="both"/>
       </w:pPr>
       <w:r>
-        <w:t>Footer links use a responsive grid: grid grid-cols-2 md:grid-cols-4 lg:grid-cols-6, scaling from </w:t>
+        <w:t xml:space="preserve">Footer links use a responsive grid: grid grid-cols-2 </w:t>
+      </w:r>
+      <w:proofErr w:type="gramStart"/>
+      <w:r>
+        <w:t>md:grid</w:t>
+      </w:r>
+      <w:proofErr w:type="gramEnd"/>
+      <w:r>
+        <w:t xml:space="preserve">-cols-4 </w:t>
+      </w:r>
+      <w:proofErr w:type="gramStart"/>
+      <w:r>
+        <w:t>lg:grid</w:t>
+      </w:r>
+      <w:proofErr w:type="gramEnd"/>
+      <w:r>
+        <w:t>-cols-6, scaling from </w:t>
       </w:r>
       <w:r>
         <w:rPr>
@@ -6976,6 +7940,9 @@
         <w:jc w:val="both"/>
       </w:pPr>
       <w:r>
+        <w:rPr>
+          <w:noProof/>
+        </w:rPr>
         <w:lastRenderedPageBreak/>
         <w:drawing>
           <wp:inline distT="0" distB="0" distL="0" distR="0" wp14:anchorId="16BC3931" wp14:editId="6D96E261">
@@ -7024,6 +7991,9 @@
         <w:jc w:val="both"/>
       </w:pPr>
       <w:r>
+        <w:rPr>
+          <w:noProof/>
+        </w:rPr>
         <w:drawing>
           <wp:inline distT="0" distB="0" distL="0" distR="0" wp14:anchorId="450644C8" wp14:editId="7530932D">
             <wp:extent cx="5731510" cy="3007360"/>
@@ -7153,8 +8123,13 @@
         <w:jc w:val="both"/>
       </w:pPr>
       <w:r>
-        <w:t>Session management is handled entirely by the AuthService</w:t>
-      </w:r>
+        <w:t>Session management is handled entirely by the </w:t>
+      </w:r>
+      <w:proofErr w:type="spellStart"/>
+      <w:r>
+        <w:t>AuthService</w:t>
+      </w:r>
+      <w:proofErr w:type="spellEnd"/>
     </w:p>
     <w:p>
       <w:pPr>
@@ -7169,6 +8144,9 @@
         <w:jc w:val="both"/>
       </w:pPr>
       <w:r>
+        <w:rPr>
+          <w:noProof/>
+        </w:rPr>
         <w:drawing>
           <wp:inline distT="0" distB="0" distL="0" distR="0" wp14:anchorId="738F4AA4" wp14:editId="39E1BD64">
             <wp:extent cx="4777089" cy="3039533"/>
@@ -7225,6 +8203,9 @@
         <w:jc w:val="both"/>
       </w:pPr>
       <w:r>
+        <w:rPr>
+          <w:noProof/>
+        </w:rPr>
         <w:drawing>
           <wp:inline distT="0" distB="0" distL="0" distR="0" wp14:anchorId="1D46A614" wp14:editId="6FE1DA04">
             <wp:extent cx="5731510" cy="2639060"/>
@@ -7281,6 +8262,9 @@
         <w:jc w:val="both"/>
       </w:pPr>
       <w:r>
+        <w:rPr>
+          <w:noProof/>
+        </w:rPr>
         <w:drawing>
           <wp:inline distT="0" distB="0" distL="0" distR="0" wp14:anchorId="61D9B396" wp14:editId="2DC152F9">
             <wp:extent cx="3920067" cy="1116222"/>
@@ -7335,7 +8319,23 @@
           <w:bCs/>
         </w:rPr>
         <w:lastRenderedPageBreak/>
-        <w:t>Why session Storage instead of localStorage?</w:t>
+        <w:t xml:space="preserve">Why session Storage instead of </w:t>
+      </w:r>
+      <w:proofErr w:type="spellStart"/>
+      <w:r>
+        <w:rPr>
+          <w:b/>
+          <w:bCs/>
+        </w:rPr>
+        <w:t>localStorage</w:t>
+      </w:r>
+      <w:proofErr w:type="spellEnd"/>
+      <w:r>
+        <w:rPr>
+          <w:b/>
+          <w:bCs/>
+        </w:rPr>
+        <w:t>?</w:t>
       </w:r>
     </w:p>
     <w:p>
@@ -7345,8 +8345,13 @@
         </w:tabs>
         <w:jc w:val="both"/>
       </w:pPr>
-      <w:r>
-        <w:t>sessionStorage is automatically cleared when the browser tab is closed, providing a natural session boundary. This prevents stale tokens from persisting across different sessions on a shared computer, making it a more secure default.</w:t>
+      <w:proofErr w:type="spellStart"/>
+      <w:r>
+        <w:t>sessionStorage</w:t>
+      </w:r>
+      <w:proofErr w:type="spellEnd"/>
+      <w:r>
+        <w:t> is automatically cleared when the browser tab is closed, providing a natural session boundary. This prevents stale tokens from persisting across different sessions on a shared computer, making it a more secure default.</w:t>
       </w:r>
     </w:p>
     <w:p>
@@ -7412,7 +8417,17 @@
         <w:jc w:val="both"/>
       </w:pPr>
       <w:r>
-        <w:t>Backend JWT Configuration (appsettings.json)</w:t>
+        <w:t>Backend JWT Configuration (</w:t>
+      </w:r>
+      <w:proofErr w:type="spellStart"/>
+      <w:proofErr w:type="gramStart"/>
+      <w:r>
+        <w:t>appsettings.json</w:t>
+      </w:r>
+      <w:proofErr w:type="spellEnd"/>
+      <w:proofErr w:type="gramEnd"/>
+      <w:r>
+        <w:t>)</w:t>
       </w:r>
     </w:p>
     <w:p>
@@ -7423,6 +8438,9 @@
         <w:jc w:val="both"/>
       </w:pPr>
       <w:r>
+        <w:rPr>
+          <w:noProof/>
+        </w:rPr>
         <w:drawing>
           <wp:inline distT="0" distB="0" distL="0" distR="0" wp14:anchorId="0B82E3E6" wp14:editId="7A378AAC">
             <wp:extent cx="5731510" cy="1844040"/>
@@ -7468,7 +8486,15 @@
         <w:jc w:val="both"/>
       </w:pPr>
       <w:r>
-        <w:t>Token Validation Parameters (Program.cs)</w:t>
+        <w:t>Token Validation Parameters (</w:t>
+      </w:r>
+      <w:proofErr w:type="spellStart"/>
+      <w:r>
+        <w:t>Program.cs</w:t>
+      </w:r>
+      <w:proofErr w:type="spellEnd"/>
+      <w:r>
+        <w:t>)</w:t>
       </w:r>
     </w:p>
     <w:p>
@@ -7479,6 +8505,9 @@
         <w:jc w:val="both"/>
       </w:pPr>
       <w:r>
+        <w:rPr>
+          <w:noProof/>
+        </w:rPr>
         <w:drawing>
           <wp:inline distT="0" distB="0" distL="0" distR="0" wp14:anchorId="68C1D74C" wp14:editId="6DE906A7">
             <wp:extent cx="5731510" cy="2574290"/>
@@ -7535,6 +8564,9 @@
         <w:jc w:val="both"/>
       </w:pPr>
       <w:r>
+        <w:rPr>
+          <w:noProof/>
+        </w:rPr>
         <w:lastRenderedPageBreak/>
         <w:drawing>
           <wp:inline distT="0" distB="0" distL="0" distR="0" wp14:anchorId="49030DF2" wp14:editId="765675D1">
@@ -7603,7 +8635,23 @@
         <w:jc w:val="both"/>
       </w:pPr>
       <w:r>
-        <w:t>2. LoginComponent calls authService.login()</w:t>
+        <w:t xml:space="preserve">2. </w:t>
+      </w:r>
+      <w:proofErr w:type="spellStart"/>
+      <w:r>
+        <w:t>LoginComponent</w:t>
+      </w:r>
+      <w:proofErr w:type="spellEnd"/>
+      <w:r>
+        <w:t xml:space="preserve"> calls </w:t>
+      </w:r>
+      <w:proofErr w:type="spellStart"/>
+      <w:r>
+        <w:t>authService.login</w:t>
+      </w:r>
+      <w:proofErr w:type="spellEnd"/>
+      <w:r>
+        <w:t>()</w:t>
       </w:r>
     </w:p>
     <w:p>
@@ -7614,8 +8662,37 @@
         <w:jc w:val="both"/>
       </w:pPr>
       <w:r>
-        <w:t>3. authService sends POST /api/auth/login with { identifier, password }</w:t>
-      </w:r>
+        <w:t xml:space="preserve">3. </w:t>
+      </w:r>
+      <w:proofErr w:type="spellStart"/>
+      <w:r>
+        <w:t>authService</w:t>
+      </w:r>
+      <w:proofErr w:type="spellEnd"/>
+      <w:r>
+        <w:t xml:space="preserve"> sends POST /</w:t>
+      </w:r>
+      <w:proofErr w:type="spellStart"/>
+      <w:r>
+        <w:t>api</w:t>
+      </w:r>
+      <w:proofErr w:type="spellEnd"/>
+      <w:r>
+        <w:t xml:space="preserve">/auth/login with </w:t>
+      </w:r>
+      <w:proofErr w:type="gramStart"/>
+      <w:r>
+        <w:t>{ identifier</w:t>
+      </w:r>
+      <w:proofErr w:type="gramEnd"/>
+      <w:r>
+        <w:t xml:space="preserve">, </w:t>
+      </w:r>
+      <w:proofErr w:type="gramStart"/>
+      <w:r>
+        <w:t>password }</w:t>
+      </w:r>
+      <w:proofErr w:type="gramEnd"/>
     </w:p>
     <w:p>
       <w:pPr>
@@ -7636,8 +8713,21 @@
         <w:jc w:val="both"/>
       </w:pPr>
       <w:r>
-        <w:t>5. authService.setSession() stores token in sessionStorage</w:t>
-      </w:r>
+        <w:t xml:space="preserve">5. </w:t>
+      </w:r>
+      <w:proofErr w:type="spellStart"/>
+      <w:r>
+        <w:t>authService.setSession</w:t>
+      </w:r>
+      <w:proofErr w:type="spellEnd"/>
+      <w:r>
+        <w:t xml:space="preserve">() stores token in </w:t>
+      </w:r>
+      <w:proofErr w:type="spellStart"/>
+      <w:r>
+        <w:t>sessionStorage</w:t>
+      </w:r>
+      <w:proofErr w:type="spellEnd"/>
     </w:p>
     <w:p>
       <w:pPr>
@@ -7647,7 +8737,15 @@
         <w:jc w:val="both"/>
       </w:pPr>
       <w:r>
-        <w:t>6. User navigates to /my-appointments (guarded by authGuard)</w:t>
+        <w:t xml:space="preserve">6. User navigates to /my-appointments (guarded by </w:t>
+      </w:r>
+      <w:proofErr w:type="spellStart"/>
+      <w:r>
+        <w:t>authGuard</w:t>
+      </w:r>
+      <w:proofErr w:type="spellEnd"/>
+      <w:r>
+        <w:t>)</w:t>
       </w:r>
     </w:p>
     <w:p>
@@ -7658,7 +8756,23 @@
         <w:jc w:val="both"/>
       </w:pPr>
       <w:r>
-        <w:t>7. authGuard checks authService.isAuthenticated() → true → allows navigation</w:t>
+        <w:t xml:space="preserve">7. </w:t>
+      </w:r>
+      <w:proofErr w:type="spellStart"/>
+      <w:r>
+        <w:t>authGuard</w:t>
+      </w:r>
+      <w:proofErr w:type="spellEnd"/>
+      <w:r>
+        <w:t xml:space="preserve"> checks </w:t>
+      </w:r>
+      <w:proofErr w:type="spellStart"/>
+      <w:r>
+        <w:t>authService.isAuthenticated</w:t>
+      </w:r>
+      <w:proofErr w:type="spellEnd"/>
+      <w:r>
+        <w:t>() → true → allows navigation</w:t>
       </w:r>
     </w:p>
     <w:p>
@@ -7669,7 +8783,23 @@
         <w:jc w:val="both"/>
       </w:pPr>
       <w:r>
-        <w:t>8. MyAppointments component calls appointmentService.getMyAppointments()</w:t>
+        <w:t xml:space="preserve">8. </w:t>
+      </w:r>
+      <w:proofErr w:type="spellStart"/>
+      <w:r>
+        <w:t>MyAppointments</w:t>
+      </w:r>
+      <w:proofErr w:type="spellEnd"/>
+      <w:r>
+        <w:t xml:space="preserve"> component calls </w:t>
+      </w:r>
+      <w:proofErr w:type="spellStart"/>
+      <w:r>
+        <w:t>appointmentService.getMyAppointments</w:t>
+      </w:r>
+      <w:proofErr w:type="spellEnd"/>
+      <w:r>
+        <w:t>()</w:t>
       </w:r>
     </w:p>
     <w:p>
@@ -7680,7 +8810,23 @@
         <w:jc w:val="both"/>
       </w:pPr>
       <w:r>
-        <w:t>9. authInterceptor reads token from sessionStorage, adds Authorization header</w:t>
+        <w:t xml:space="preserve">9. </w:t>
+      </w:r>
+      <w:proofErr w:type="spellStart"/>
+      <w:r>
+        <w:t>authInterceptor</w:t>
+      </w:r>
+      <w:proofErr w:type="spellEnd"/>
+      <w:r>
+        <w:t xml:space="preserve"> reads token from </w:t>
+      </w:r>
+      <w:proofErr w:type="spellStart"/>
+      <w:r>
+        <w:t>sessionStorage</w:t>
+      </w:r>
+      <w:proofErr w:type="spellEnd"/>
+      <w:r>
+        <w:t>, adds Authorization header</w:t>
       </w:r>
     </w:p>
     <w:p>
@@ -7691,7 +8837,15 @@
         <w:jc w:val="both"/>
       </w:pPr>
       <w:r>
-        <w:t>10. Backend validates JWT → extracts UserId from claims → returns only that user's appointments</w:t>
+        <w:t xml:space="preserve">10. Backend validates JWT → extracts </w:t>
+      </w:r>
+      <w:proofErr w:type="spellStart"/>
+      <w:r>
+        <w:t>UserId</w:t>
+      </w:r>
+      <w:proofErr w:type="spellEnd"/>
+      <w:r>
+        <w:t xml:space="preserve"> from claims → returns only that user's appointments</w:t>
       </w:r>
     </w:p>
     <w:p>
@@ -7718,21 +8872,7 @@
           <w:b/>
           <w:bCs/>
         </w:rPr>
-        <w:t xml:space="preserve">13. Testing </w:t>
-      </w:r>
-      <w:r>
-        <w:rPr>
-          <w:b/>
-          <w:bCs/>
-        </w:rPr>
-        <w:t xml:space="preserve">- </w:t>
-      </w:r>
-      <w:r>
-        <w:rPr>
-          <w:b/>
-          <w:bCs/>
-        </w:rPr>
-        <w:t xml:space="preserve"> Component &amp; End-to-End</w:t>
+        <w:t>13. Testing - Unit, Integration &amp; End-to-End</w:t>
       </w:r>
     </w:p>
     <w:p>
@@ -7743,7 +8883,15 @@
         <w:jc w:val="both"/>
       </w:pPr>
       <w:r>
-        <w:t>Unit Test — Root App Component (app.spec.ts)</w:t>
+        <w:t>A. Backend Unit Testing (</w:t>
+      </w:r>
+      <w:proofErr w:type="spellStart"/>
+      <w:r>
+        <w:t>xUnit</w:t>
+      </w:r>
+      <w:proofErr w:type="spellEnd"/>
+      <w:r>
+        <w:t>)</w:t>
       </w:r>
     </w:p>
     <w:p>
@@ -7754,53 +8902,161 @@
         <w:jc w:val="both"/>
       </w:pPr>
       <w:r>
-        <w:t>The Angular project includes an initial unit test for the root App component using the Angular Testing Utilities:</w:t>
-      </w:r>
-    </w:p>
-    <w:p>
-      <w:pPr>
+        <w:t>A dedicated test project, </w:t>
+      </w:r>
+      <w:proofErr w:type="spellStart"/>
+      <w:proofErr w:type="gramStart"/>
+      <w:r>
+        <w:t>Fracto.Api.Tests</w:t>
+      </w:r>
+      <w:proofErr w:type="spellEnd"/>
+      <w:proofErr w:type="gramEnd"/>
+      <w:r>
+        <w:t>, was implemented using </w:t>
+      </w:r>
+      <w:proofErr w:type="spellStart"/>
+      <w:r>
+        <w:rPr>
+          <w:b/>
+          <w:bCs/>
+        </w:rPr>
+        <w:t>xUnit</w:t>
+      </w:r>
+      <w:proofErr w:type="spellEnd"/>
+      <w:r>
+        <w:t> and </w:t>
+      </w:r>
+      <w:proofErr w:type="spellStart"/>
+      <w:r>
+        <w:rPr>
+          <w:b/>
+          <w:bCs/>
+        </w:rPr>
+        <w:t>Moq</w:t>
+      </w:r>
+      <w:proofErr w:type="spellEnd"/>
+      <w:r>
+        <w:t>.</w:t>
+      </w:r>
+    </w:p>
+    <w:p>
+      <w:pPr>
+        <w:numPr>
+          <w:ilvl w:val="0"/>
+          <w:numId w:val="34"/>
+        </w:numPr>
         <w:tabs>
           <w:tab w:val="left" w:pos="1013"/>
         </w:tabs>
         <w:jc w:val="both"/>
       </w:pPr>
       <w:r>
+        <w:rPr>
+          <w:b/>
+          <w:bCs/>
+        </w:rPr>
+        <w:t>Mocking Strategy:</w:t>
+      </w:r>
+      <w:r>
+        <w:t> Utilized </w:t>
+      </w:r>
+      <w:proofErr w:type="spellStart"/>
+      <w:proofErr w:type="gramStart"/>
+      <w:r>
+        <w:t>Microsoft.EntityFrameworkCore.InMemory</w:t>
+      </w:r>
+      <w:proofErr w:type="spellEnd"/>
+      <w:proofErr w:type="gramEnd"/>
+      <w:r>
+        <w:t> to simulate database operations without a real SQL instance, allowing for fast, isolated tests.</w:t>
+      </w:r>
+    </w:p>
+    <w:p>
+      <w:pPr>
+        <w:numPr>
+          <w:ilvl w:val="0"/>
+          <w:numId w:val="34"/>
+        </w:numPr>
+        <w:tabs>
+          <w:tab w:val="left" w:pos="1013"/>
+        </w:tabs>
+        <w:jc w:val="both"/>
+      </w:pPr>
+      <w:r>
+        <w:rPr>
+          <w:b/>
+          <w:bCs/>
+        </w:rPr>
+        <w:t>Coverage:</w:t>
+      </w:r>
+      <w:r>
+        <w:t> Verified </w:t>
+      </w:r>
+    </w:p>
+    <w:p>
+      <w:pPr>
+        <w:tabs>
+          <w:tab w:val="left" w:pos="1013"/>
+        </w:tabs>
+        <w:jc w:val="both"/>
+      </w:pPr>
+      <w:proofErr w:type="spellStart"/>
+      <w:r>
+        <w:t>AuthController</w:t>
+      </w:r>
+      <w:proofErr w:type="spellEnd"/>
+      <w:r>
+        <w:t> (Registration/Login logic) and </w:t>
+      </w:r>
+    </w:p>
+    <w:p>
+      <w:pPr>
+        <w:tabs>
+          <w:tab w:val="left" w:pos="1013"/>
+        </w:tabs>
+        <w:jc w:val="both"/>
+      </w:pPr>
+      <w:proofErr w:type="spellStart"/>
+      <w:r>
+        <w:t>DoctorsController</w:t>
+      </w:r>
+      <w:proofErr w:type="spellEnd"/>
+      <w:r>
+        <w:t> (CRUD and Slot filtering).</w:t>
+      </w:r>
+    </w:p>
+    <w:p>
+      <w:pPr>
+        <w:numPr>
+          <w:ilvl w:val="0"/>
+          <w:numId w:val="34"/>
+        </w:numPr>
+        <w:tabs>
+          <w:tab w:val="left" w:pos="1013"/>
+        </w:tabs>
+        <w:jc w:val="both"/>
+      </w:pPr>
+      <w:r>
+        <w:rPr>
+          <w:b/>
+          <w:bCs/>
+        </w:rPr>
+        <w:t>Execution:</w:t>
+      </w:r>
+      <w:r>
+        <w:t> dotnet test</w:t>
+      </w:r>
+    </w:p>
+    <w:p>
+      <w:pPr>
+        <w:tabs>
+          <w:tab w:val="left" w:pos="1013"/>
+        </w:tabs>
+        <w:jc w:val="both"/>
+      </w:pPr>
+      <w:r>
         <w:lastRenderedPageBreak/>
-        <w:drawing>
-          <wp:inline distT="0" distB="0" distL="0" distR="0" wp14:anchorId="5FE4019D" wp14:editId="2983F4ED">
-            <wp:extent cx="4724400" cy="3614748"/>
-            <wp:effectExtent l="0" t="0" r="0" b="5080"/>
-            <wp:docPr id="1965384562" name="Picture 1"/>
-            <wp:cNvGraphicFramePr>
-              <a:graphicFrameLocks xmlns:a="http://schemas.openxmlformats.org/drawingml/2006/main" noChangeAspect="1"/>
-            </wp:cNvGraphicFramePr>
-            <a:graphic xmlns:a="http://schemas.openxmlformats.org/drawingml/2006/main">
-              <a:graphicData uri="http://schemas.openxmlformats.org/drawingml/2006/picture">
-                <pic:pic xmlns:pic="http://schemas.openxmlformats.org/drawingml/2006/picture">
-                  <pic:nvPicPr>
-                    <pic:cNvPr id="1965384562" name=""/>
-                    <pic:cNvPicPr/>
-                  </pic:nvPicPr>
-                  <pic:blipFill>
-                    <a:blip r:embed="rId48"/>
-                    <a:stretch>
-                      <a:fillRect/>
-                    </a:stretch>
-                  </pic:blipFill>
-                  <pic:spPr>
-                    <a:xfrm>
-                      <a:off x="0" y="0"/>
-                      <a:ext cx="4745410" cy="3630823"/>
-                    </a:xfrm>
-                    <a:prstGeom prst="rect">
-                      <a:avLst/>
-                    </a:prstGeom>
-                  </pic:spPr>
-                </pic:pic>
-              </a:graphicData>
-            </a:graphic>
-          </wp:inline>
-        </w:drawing>
+        <w:t>How to Run Tests</w:t>
       </w:r>
     </w:p>
     <w:p>
@@ -7811,17 +9067,9 @@
         <w:jc w:val="both"/>
       </w:pPr>
       <w:r>
-        <w:t>How to Run Tests</w:t>
-      </w:r>
-    </w:p>
-    <w:p>
-      <w:pPr>
-        <w:tabs>
-          <w:tab w:val="left" w:pos="1013"/>
-        </w:tabs>
-        <w:jc w:val="both"/>
-      </w:pPr>
-      <w:r>
+        <w:rPr>
+          <w:noProof/>
+        </w:rPr>
         <w:drawing>
           <wp:inline distT="0" distB="0" distL="0" distR="0" wp14:anchorId="7A8393F4" wp14:editId="24CFEB8F">
             <wp:extent cx="5620534" cy="1962424"/>
@@ -7838,7 +9086,7 @@
                     <pic:cNvPicPr/>
                   </pic:nvPicPr>
                   <pic:blipFill>
-                    <a:blip r:embed="rId49"/>
+                    <a:blip r:embed="rId48"/>
                     <a:stretch>
                       <a:fillRect/>
                     </a:stretch>
@@ -7867,184 +9115,236 @@
         <w:jc w:val="both"/>
       </w:pPr>
       <w:r>
-        <w:t>Testing Tools Used</w:t>
-      </w:r>
-    </w:p>
-    <w:tbl>
-      <w:tblPr>
-        <w:tblStyle w:val="TableGrid"/>
-        <w:tblW w:w="0" w:type="auto"/>
-        <w:tblLook w:val="04A0" w:firstRow="1" w:lastRow="0" w:firstColumn="1" w:lastColumn="0" w:noHBand="0" w:noVBand="1"/>
-      </w:tblPr>
-      <w:tblGrid>
-        <w:gridCol w:w="1111"/>
-        <w:gridCol w:w="5699"/>
-      </w:tblGrid>
-      <w:tr>
-        <w:tc>
-          <w:tcPr>
-            <w:tcW w:w="0" w:type="auto"/>
-            <w:hideMark/>
-          </w:tcPr>
-          <w:p>
-            <w:pPr>
-              <w:tabs>
-                <w:tab w:val="left" w:pos="1013"/>
-              </w:tabs>
-              <w:spacing w:after="160" w:line="278" w:lineRule="auto"/>
-              <w:jc w:val="both"/>
-            </w:pPr>
-            <w:r>
-              <w:t>Tool</w:t>
-            </w:r>
-          </w:p>
-        </w:tc>
-        <w:tc>
-          <w:tcPr>
-            <w:tcW w:w="0" w:type="auto"/>
-            <w:hideMark/>
-          </w:tcPr>
-          <w:p>
-            <w:pPr>
-              <w:tabs>
-                <w:tab w:val="left" w:pos="1013"/>
-              </w:tabs>
-              <w:spacing w:after="160" w:line="278" w:lineRule="auto"/>
-              <w:jc w:val="both"/>
-            </w:pPr>
-            <w:r>
-              <w:t>Purpose</w:t>
-            </w:r>
-          </w:p>
-        </w:tc>
-      </w:tr>
-      <w:tr>
-        <w:tc>
-          <w:tcPr>
-            <w:tcW w:w="0" w:type="auto"/>
-            <w:hideMark/>
-          </w:tcPr>
-          <w:p>
-            <w:pPr>
-              <w:tabs>
-                <w:tab w:val="left" w:pos="1013"/>
-              </w:tabs>
-              <w:spacing w:after="160" w:line="278" w:lineRule="auto"/>
-              <w:jc w:val="both"/>
-            </w:pPr>
-            <w:r>
-              <w:rPr>
-                <w:b/>
-                <w:bCs/>
-              </w:rPr>
-              <w:t>Karma</w:t>
-            </w:r>
-          </w:p>
-        </w:tc>
-        <w:tc>
-          <w:tcPr>
-            <w:tcW w:w="0" w:type="auto"/>
-            <w:hideMark/>
-          </w:tcPr>
-          <w:p>
-            <w:pPr>
-              <w:tabs>
-                <w:tab w:val="left" w:pos="1013"/>
-              </w:tabs>
-              <w:spacing w:after="160" w:line="278" w:lineRule="auto"/>
-              <w:jc w:val="both"/>
-            </w:pPr>
-            <w:r>
-              <w:t>Test runner (launches Chrome headless)</w:t>
-            </w:r>
-          </w:p>
-        </w:tc>
-      </w:tr>
-      <w:tr>
-        <w:tc>
-          <w:tcPr>
-            <w:tcW w:w="0" w:type="auto"/>
-            <w:hideMark/>
-          </w:tcPr>
-          <w:p>
-            <w:pPr>
-              <w:tabs>
-                <w:tab w:val="left" w:pos="1013"/>
-              </w:tabs>
-              <w:spacing w:after="160" w:line="278" w:lineRule="auto"/>
-              <w:jc w:val="both"/>
-            </w:pPr>
-            <w:r>
-              <w:rPr>
-                <w:b/>
-                <w:bCs/>
-              </w:rPr>
-              <w:t>Jasmine</w:t>
-            </w:r>
-          </w:p>
-        </w:tc>
-        <w:tc>
-          <w:tcPr>
-            <w:tcW w:w="0" w:type="auto"/>
-            <w:hideMark/>
-          </w:tcPr>
-          <w:p>
-            <w:pPr>
-              <w:tabs>
-                <w:tab w:val="left" w:pos="1013"/>
-              </w:tabs>
-              <w:spacing w:after="160" w:line="278" w:lineRule="auto"/>
-              <w:jc w:val="both"/>
-            </w:pPr>
-            <w:r>
-              <w:t>Testing framework (describe/it/expect syntax)</w:t>
-            </w:r>
-          </w:p>
-        </w:tc>
-      </w:tr>
-      <w:tr>
-        <w:tc>
-          <w:tcPr>
-            <w:tcW w:w="0" w:type="auto"/>
-            <w:hideMark/>
-          </w:tcPr>
-          <w:p>
-            <w:pPr>
-              <w:tabs>
-                <w:tab w:val="left" w:pos="1013"/>
-              </w:tabs>
-              <w:spacing w:after="160" w:line="278" w:lineRule="auto"/>
-              <w:jc w:val="both"/>
-            </w:pPr>
-            <w:r>
-              <w:rPr>
-                <w:b/>
-                <w:bCs/>
-              </w:rPr>
-              <w:t>TestBed</w:t>
-            </w:r>
-          </w:p>
-        </w:tc>
-        <w:tc>
-          <w:tcPr>
-            <w:tcW w:w="0" w:type="auto"/>
-            <w:hideMark/>
-          </w:tcPr>
-          <w:p>
-            <w:pPr>
-              <w:tabs>
-                <w:tab w:val="left" w:pos="1013"/>
-              </w:tabs>
-              <w:spacing w:after="160" w:line="278" w:lineRule="auto"/>
-              <w:jc w:val="both"/>
-            </w:pPr>
-            <w:r>
-              <w:t>Angular's testing module for component instantiation</w:t>
-            </w:r>
-          </w:p>
-        </w:tc>
-      </w:tr>
-    </w:tbl>
+        <w:t>B. Frontend Component Testing (</w:t>
+      </w:r>
+      <w:proofErr w:type="spellStart"/>
+      <w:r>
+        <w:t>Vitest</w:t>
+      </w:r>
+      <w:proofErr w:type="spellEnd"/>
+      <w:r>
+        <w:t>)</w:t>
+      </w:r>
+    </w:p>
+    <w:p>
+      <w:pPr>
+        <w:tabs>
+          <w:tab w:val="left" w:pos="1013"/>
+        </w:tabs>
+        <w:jc w:val="both"/>
+      </w:pPr>
+      <w:r>
+        <w:t xml:space="preserve">Transitioned to </w:t>
+      </w:r>
+      <w:proofErr w:type="spellStart"/>
+      <w:r>
+        <w:t>Vitest</w:t>
+      </w:r>
+      <w:proofErr w:type="spellEnd"/>
+      <w:r>
+        <w:t xml:space="preserve"> for blistering fast unit testing of Angular standalone components.</w:t>
+      </w:r>
+    </w:p>
+    <w:p>
+      <w:pPr>
+        <w:tabs>
+          <w:tab w:val="left" w:pos="1013"/>
+        </w:tabs>
+        <w:jc w:val="both"/>
+      </w:pPr>
+    </w:p>
+    <w:p>
+      <w:pPr>
+        <w:pStyle w:val="ListParagraph"/>
+        <w:numPr>
+          <w:ilvl w:val="0"/>
+          <w:numId w:val="36"/>
+        </w:numPr>
+        <w:tabs>
+          <w:tab w:val="left" w:pos="1013"/>
+        </w:tabs>
+        <w:jc w:val="both"/>
+      </w:pPr>
+      <w:r>
+        <w:t>Logic Verification: Tests for Login</w:t>
+      </w:r>
+      <w:r>
+        <w:t xml:space="preserve"> </w:t>
+      </w:r>
+      <w:proofErr w:type="gramStart"/>
+      <w:r>
+        <w:t xml:space="preserve">and </w:t>
+      </w:r>
+      <w:r>
+        <w:t xml:space="preserve"> </w:t>
+      </w:r>
+      <w:r>
+        <w:t>Register</w:t>
+      </w:r>
+      <w:proofErr w:type="gramEnd"/>
+      <w:r>
+        <w:t xml:space="preserve"> components verify form validation, error handling, and </w:t>
+      </w:r>
+      <w:proofErr w:type="spellStart"/>
+      <w:r>
+        <w:t>AuthService</w:t>
+      </w:r>
+      <w:proofErr w:type="spellEnd"/>
+      <w:r>
+        <w:t xml:space="preserve"> </w:t>
+      </w:r>
+      <w:r>
+        <w:t>integration.</w:t>
+      </w:r>
+    </w:p>
+    <w:p>
+      <w:pPr>
+        <w:pStyle w:val="ListParagraph"/>
+        <w:numPr>
+          <w:ilvl w:val="0"/>
+          <w:numId w:val="36"/>
+        </w:numPr>
+        <w:tabs>
+          <w:tab w:val="left" w:pos="1013"/>
+        </w:tabs>
+        <w:jc w:val="both"/>
+      </w:pPr>
+      <w:r>
+        <w:t xml:space="preserve">Mocking: Used </w:t>
+      </w:r>
+      <w:proofErr w:type="spellStart"/>
+      <w:r>
+        <w:t>TestBed</w:t>
+      </w:r>
+      <w:proofErr w:type="spellEnd"/>
+      <w:r>
+        <w:t xml:space="preserve"> and </w:t>
+      </w:r>
+      <w:proofErr w:type="spellStart"/>
+      <w:r>
+        <w:t>provideRouter</w:t>
+      </w:r>
+      <w:proofErr w:type="spellEnd"/>
+      <w:r>
+        <w:t xml:space="preserve"> to isolate components from external dependencies.</w:t>
+      </w:r>
+    </w:p>
+    <w:p>
+      <w:pPr>
+        <w:pStyle w:val="ListParagraph"/>
+        <w:numPr>
+          <w:ilvl w:val="0"/>
+          <w:numId w:val="36"/>
+        </w:numPr>
+        <w:tabs>
+          <w:tab w:val="left" w:pos="1013"/>
+        </w:tabs>
+        <w:jc w:val="both"/>
+      </w:pPr>
+      <w:r>
+        <w:t xml:space="preserve">Execution: </w:t>
+      </w:r>
+      <w:proofErr w:type="spellStart"/>
+      <w:r>
+        <w:t>npm</w:t>
+      </w:r>
+      <w:proofErr w:type="spellEnd"/>
+      <w:r>
+        <w:t xml:space="preserve"> run test (mapped to ng test via </w:t>
+      </w:r>
+      <w:proofErr w:type="spellStart"/>
+      <w:r>
+        <w:t>Vitest</w:t>
+      </w:r>
+      <w:proofErr w:type="spellEnd"/>
+      <w:r>
+        <w:t xml:space="preserve"> runner).</w:t>
+      </w:r>
+    </w:p>
+    <w:p>
+      <w:pPr>
+        <w:tabs>
+          <w:tab w:val="left" w:pos="1013"/>
+        </w:tabs>
+        <w:jc w:val="both"/>
+      </w:pPr>
+    </w:p>
+    <w:p>
+      <w:pPr>
+        <w:tabs>
+          <w:tab w:val="left" w:pos="1013"/>
+        </w:tabs>
+        <w:jc w:val="both"/>
+        <w:rPr>
+          <w:b/>
+          <w:bCs/>
+        </w:rPr>
+      </w:pPr>
+      <w:r>
+        <w:rPr>
+          <w:b/>
+          <w:bCs/>
+        </w:rPr>
+        <w:t>C. End-to-End Testing (Playwright)</w:t>
+      </w:r>
+    </w:p>
+    <w:p>
+      <w:pPr>
+        <w:tabs>
+          <w:tab w:val="left" w:pos="1013"/>
+        </w:tabs>
+        <w:jc w:val="both"/>
+      </w:pPr>
+      <w:r>
+        <w:t>Implemented Playwright for automated browser testing of the critical user journey.</w:t>
+      </w:r>
+    </w:p>
+    <w:p>
+      <w:pPr>
+        <w:pStyle w:val="ListParagraph"/>
+        <w:numPr>
+          <w:ilvl w:val="0"/>
+          <w:numId w:val="35"/>
+        </w:numPr>
+        <w:tabs>
+          <w:tab w:val="left" w:pos="1013"/>
+        </w:tabs>
+        <w:jc w:val="both"/>
+      </w:pPr>
+      <w:r>
+        <w:t>Scenario: The login.e2e.spec.ts</w:t>
+      </w:r>
+      <w:r>
+        <w:t xml:space="preserve"> </w:t>
+      </w:r>
+      <w:r>
+        <w:t>suite automates a headless Chromium browser to navigate to the Login page, enter credentials, and verify a successful redirect to the dashboard.</w:t>
+      </w:r>
+    </w:p>
+    <w:p>
+      <w:pPr>
+        <w:pStyle w:val="ListParagraph"/>
+        <w:numPr>
+          <w:ilvl w:val="0"/>
+          <w:numId w:val="35"/>
+        </w:numPr>
+        <w:tabs>
+          <w:tab w:val="left" w:pos="1013"/>
+        </w:tabs>
+        <w:jc w:val="both"/>
+      </w:pPr>
+      <w:r>
+        <w:t xml:space="preserve">Execution: </w:t>
+      </w:r>
+      <w:proofErr w:type="spellStart"/>
+      <w:r>
+        <w:t>npx</w:t>
+      </w:r>
+      <w:proofErr w:type="spellEnd"/>
+      <w:r>
+        <w:t xml:space="preserve"> playwright test</w:t>
+      </w:r>
+    </w:p>
     <w:p>
       <w:pPr>
         <w:tabs>
@@ -8110,11 +9410,18 @@
           <w:b/>
           <w:bCs/>
         </w:rPr>
-        <w:lastRenderedPageBreak/>
         <w:t>Backend Project:</w:t>
       </w:r>
       <w:r>
-        <w:t> Fracto.Api — ASP.NET Core 8 Web API</w:t>
+        <w:t> </w:t>
+      </w:r>
+      <w:proofErr w:type="spellStart"/>
+      <w:r>
+        <w:t>Fracto.Api</w:t>
+      </w:r>
+      <w:proofErr w:type="spellEnd"/>
+      <w:r>
+        <w:t> — ASP.NET Core 8 Web API</w:t>
       </w:r>
     </w:p>
     <w:p>
@@ -8136,7 +9443,15 @@
         <w:t>Frontend Project:</w:t>
       </w:r>
       <w:r>
-        <w:t> Fracto.Web — Angular 18</w:t>
+        <w:t> </w:t>
+      </w:r>
+      <w:proofErr w:type="spellStart"/>
+      <w:r>
+        <w:t>Fracto.Web</w:t>
+      </w:r>
+      <w:proofErr w:type="spellEnd"/>
+      <w:r>
+        <w:t> — Angular 18</w:t>
       </w:r>
     </w:p>
     <w:p>
@@ -8158,6 +9473,10 @@
         <w:jc w:val="both"/>
       </w:pPr>
       <w:r>
+        <w:rPr>
+          <w:noProof/>
+        </w:rPr>
+        <w:lastRenderedPageBreak/>
         <w:drawing>
           <wp:inline distT="0" distB="0" distL="0" distR="0" wp14:anchorId="35F929A6" wp14:editId="47714388">
             <wp:extent cx="4800600" cy="2752394"/>
@@ -8174,7 +9493,7 @@
                     <pic:cNvPicPr/>
                   </pic:nvPicPr>
                   <pic:blipFill>
-                    <a:blip r:embed="rId50"/>
+                    <a:blip r:embed="rId49"/>
                     <a:stretch>
                       <a:fillRect/>
                     </a:stretch>
@@ -8713,6 +10032,119 @@
     </w:lvl>
   </w:abstractNum>
   <w:abstractNum w:abstractNumId="3" w15:restartNumberingAfterBreak="0">
+    <w:nsid w:val="0CE60FCA"/>
+    <w:multiLevelType w:val="hybridMultilevel"/>
+    <w:tmpl w:val="DE527EE4"/>
+    <w:lvl w:ilvl="0" w:tplc="40090001">
+      <w:start w:val="1"/>
+      <w:numFmt w:val="bullet"/>
+      <w:lvlText w:val=""/>
+      <w:lvlJc w:val="left"/>
+      <w:pPr>
+        <w:ind w:left="720" w:hanging="360"/>
+      </w:pPr>
+      <w:rPr>
+        <w:rFonts w:ascii="Symbol" w:hAnsi="Symbol" w:hint="default"/>
+      </w:rPr>
+    </w:lvl>
+    <w:lvl w:ilvl="1" w:tplc="40090003" w:tentative="1">
+      <w:start w:val="1"/>
+      <w:numFmt w:val="bullet"/>
+      <w:lvlText w:val="o"/>
+      <w:lvlJc w:val="left"/>
+      <w:pPr>
+        <w:ind w:left="1440" w:hanging="360"/>
+      </w:pPr>
+      <w:rPr>
+        <w:rFonts w:ascii="Courier New" w:hAnsi="Courier New" w:cs="Courier New" w:hint="default"/>
+      </w:rPr>
+    </w:lvl>
+    <w:lvl w:ilvl="2" w:tplc="40090005" w:tentative="1">
+      <w:start w:val="1"/>
+      <w:numFmt w:val="bullet"/>
+      <w:lvlText w:val=""/>
+      <w:lvlJc w:val="left"/>
+      <w:pPr>
+        <w:ind w:left="2160" w:hanging="360"/>
+      </w:pPr>
+      <w:rPr>
+        <w:rFonts w:ascii="Wingdings" w:hAnsi="Wingdings" w:hint="default"/>
+      </w:rPr>
+    </w:lvl>
+    <w:lvl w:ilvl="3" w:tplc="40090001" w:tentative="1">
+      <w:start w:val="1"/>
+      <w:numFmt w:val="bullet"/>
+      <w:lvlText w:val=""/>
+      <w:lvlJc w:val="left"/>
+      <w:pPr>
+        <w:ind w:left="2880" w:hanging="360"/>
+      </w:pPr>
+      <w:rPr>
+        <w:rFonts w:ascii="Symbol" w:hAnsi="Symbol" w:hint="default"/>
+      </w:rPr>
+    </w:lvl>
+    <w:lvl w:ilvl="4" w:tplc="40090003" w:tentative="1">
+      <w:start w:val="1"/>
+      <w:numFmt w:val="bullet"/>
+      <w:lvlText w:val="o"/>
+      <w:lvlJc w:val="left"/>
+      <w:pPr>
+        <w:ind w:left="3600" w:hanging="360"/>
+      </w:pPr>
+      <w:rPr>
+        <w:rFonts w:ascii="Courier New" w:hAnsi="Courier New" w:cs="Courier New" w:hint="default"/>
+      </w:rPr>
+    </w:lvl>
+    <w:lvl w:ilvl="5" w:tplc="40090005" w:tentative="1">
+      <w:start w:val="1"/>
+      <w:numFmt w:val="bullet"/>
+      <w:lvlText w:val=""/>
+      <w:lvlJc w:val="left"/>
+      <w:pPr>
+        <w:ind w:left="4320" w:hanging="360"/>
+      </w:pPr>
+      <w:rPr>
+        <w:rFonts w:ascii="Wingdings" w:hAnsi="Wingdings" w:hint="default"/>
+      </w:rPr>
+    </w:lvl>
+    <w:lvl w:ilvl="6" w:tplc="40090001" w:tentative="1">
+      <w:start w:val="1"/>
+      <w:numFmt w:val="bullet"/>
+      <w:lvlText w:val=""/>
+      <w:lvlJc w:val="left"/>
+      <w:pPr>
+        <w:ind w:left="5040" w:hanging="360"/>
+      </w:pPr>
+      <w:rPr>
+        <w:rFonts w:ascii="Symbol" w:hAnsi="Symbol" w:hint="default"/>
+      </w:rPr>
+    </w:lvl>
+    <w:lvl w:ilvl="7" w:tplc="40090003" w:tentative="1">
+      <w:start w:val="1"/>
+      <w:numFmt w:val="bullet"/>
+      <w:lvlText w:val="o"/>
+      <w:lvlJc w:val="left"/>
+      <w:pPr>
+        <w:ind w:left="5760" w:hanging="360"/>
+      </w:pPr>
+      <w:rPr>
+        <w:rFonts w:ascii="Courier New" w:hAnsi="Courier New" w:cs="Courier New" w:hint="default"/>
+      </w:rPr>
+    </w:lvl>
+    <w:lvl w:ilvl="8" w:tplc="40090005" w:tentative="1">
+      <w:start w:val="1"/>
+      <w:numFmt w:val="bullet"/>
+      <w:lvlText w:val=""/>
+      <w:lvlJc w:val="left"/>
+      <w:pPr>
+        <w:ind w:left="6480" w:hanging="360"/>
+      </w:pPr>
+      <w:rPr>
+        <w:rFonts w:ascii="Wingdings" w:hAnsi="Wingdings" w:hint="default"/>
+      </w:rPr>
+    </w:lvl>
+  </w:abstractNum>
+  <w:abstractNum w:abstractNumId="4" w15:restartNumberingAfterBreak="0">
     <w:nsid w:val="13F37585"/>
     <w:multiLevelType w:val="multilevel"/>
     <w:tmpl w:val="A45CFC3A"/>
@@ -8861,7 +10293,7 @@
       </w:rPr>
     </w:lvl>
   </w:abstractNum>
-  <w:abstractNum w:abstractNumId="4" w15:restartNumberingAfterBreak="0">
+  <w:abstractNum w:abstractNumId="5" w15:restartNumberingAfterBreak="0">
     <w:nsid w:val="140C4F6C"/>
     <w:multiLevelType w:val="multilevel"/>
     <w:tmpl w:val="2E3876D0"/>
@@ -9010,7 +10442,7 @@
       </w:rPr>
     </w:lvl>
   </w:abstractNum>
-  <w:abstractNum w:abstractNumId="5" w15:restartNumberingAfterBreak="0">
+  <w:abstractNum w:abstractNumId="6" w15:restartNumberingAfterBreak="0">
     <w:nsid w:val="14AD6C3A"/>
     <w:multiLevelType w:val="multilevel"/>
     <w:tmpl w:val="549416EC"/>
@@ -9159,7 +10591,7 @@
       </w:rPr>
     </w:lvl>
   </w:abstractNum>
-  <w:abstractNum w:abstractNumId="6" w15:restartNumberingAfterBreak="0">
+  <w:abstractNum w:abstractNumId="7" w15:restartNumberingAfterBreak="0">
     <w:nsid w:val="1AF30A0D"/>
     <w:multiLevelType w:val="multilevel"/>
     <w:tmpl w:val="A984B99C"/>
@@ -9272,7 +10704,7 @@
       </w:pPr>
     </w:lvl>
   </w:abstractNum>
-  <w:abstractNum w:abstractNumId="7" w15:restartNumberingAfterBreak="0">
+  <w:abstractNum w:abstractNumId="8" w15:restartNumberingAfterBreak="0">
     <w:nsid w:val="1C620344"/>
     <w:multiLevelType w:val="multilevel"/>
     <w:tmpl w:val="D7101532"/>
@@ -9421,7 +10853,7 @@
       </w:rPr>
     </w:lvl>
   </w:abstractNum>
-  <w:abstractNum w:abstractNumId="8" w15:restartNumberingAfterBreak="0">
+  <w:abstractNum w:abstractNumId="9" w15:restartNumberingAfterBreak="0">
     <w:nsid w:val="21526E51"/>
     <w:multiLevelType w:val="multilevel"/>
     <w:tmpl w:val="AC581CF8"/>
@@ -9570,7 +11002,7 @@
       </w:rPr>
     </w:lvl>
   </w:abstractNum>
-  <w:abstractNum w:abstractNumId="9" w15:restartNumberingAfterBreak="0">
+  <w:abstractNum w:abstractNumId="10" w15:restartNumberingAfterBreak="0">
     <w:nsid w:val="23023A0E"/>
     <w:multiLevelType w:val="multilevel"/>
     <w:tmpl w:val="EDB038D4"/>
@@ -9719,7 +11151,7 @@
       </w:rPr>
     </w:lvl>
   </w:abstractNum>
-  <w:abstractNum w:abstractNumId="10" w15:restartNumberingAfterBreak="0">
+  <w:abstractNum w:abstractNumId="11" w15:restartNumberingAfterBreak="0">
     <w:nsid w:val="260C5619"/>
     <w:multiLevelType w:val="multilevel"/>
     <w:tmpl w:val="89807E1C"/>
@@ -9868,7 +11300,7 @@
       </w:rPr>
     </w:lvl>
   </w:abstractNum>
-  <w:abstractNum w:abstractNumId="11" w15:restartNumberingAfterBreak="0">
+  <w:abstractNum w:abstractNumId="12" w15:restartNumberingAfterBreak="0">
     <w:nsid w:val="2761623A"/>
     <w:multiLevelType w:val="multilevel"/>
     <w:tmpl w:val="33AEEFD0"/>
@@ -10017,7 +11449,7 @@
       </w:rPr>
     </w:lvl>
   </w:abstractNum>
-  <w:abstractNum w:abstractNumId="12" w15:restartNumberingAfterBreak="0">
+  <w:abstractNum w:abstractNumId="13" w15:restartNumberingAfterBreak="0">
     <w:nsid w:val="27FC2FBF"/>
     <w:multiLevelType w:val="multilevel"/>
     <w:tmpl w:val="ECEA721E"/>
@@ -10166,7 +11598,7 @@
       </w:rPr>
     </w:lvl>
   </w:abstractNum>
-  <w:abstractNum w:abstractNumId="13" w15:restartNumberingAfterBreak="0">
+  <w:abstractNum w:abstractNumId="14" w15:restartNumberingAfterBreak="0">
     <w:nsid w:val="2ECD36B3"/>
     <w:multiLevelType w:val="multilevel"/>
     <w:tmpl w:val="5814604E"/>
@@ -10315,7 +11747,7 @@
       </w:rPr>
     </w:lvl>
   </w:abstractNum>
-  <w:abstractNum w:abstractNumId="14" w15:restartNumberingAfterBreak="0">
+  <w:abstractNum w:abstractNumId="15" w15:restartNumberingAfterBreak="0">
     <w:nsid w:val="31D57A90"/>
     <w:multiLevelType w:val="multilevel"/>
     <w:tmpl w:val="7D9C659A"/>
@@ -10464,7 +11896,7 @@
       </w:rPr>
     </w:lvl>
   </w:abstractNum>
-  <w:abstractNum w:abstractNumId="15" w15:restartNumberingAfterBreak="0">
+  <w:abstractNum w:abstractNumId="16" w15:restartNumberingAfterBreak="0">
     <w:nsid w:val="3869634B"/>
     <w:multiLevelType w:val="hybridMultilevel"/>
     <w:tmpl w:val="02FE1D82"/>
@@ -10577,7 +12009,7 @@
       </w:rPr>
     </w:lvl>
   </w:abstractNum>
-  <w:abstractNum w:abstractNumId="16" w15:restartNumberingAfterBreak="0">
+  <w:abstractNum w:abstractNumId="17" w15:restartNumberingAfterBreak="0">
     <w:nsid w:val="397447B1"/>
     <w:multiLevelType w:val="multilevel"/>
     <w:tmpl w:val="47AABD18"/>
@@ -10726,7 +12158,120 @@
       </w:rPr>
     </w:lvl>
   </w:abstractNum>
-  <w:abstractNum w:abstractNumId="17" w15:restartNumberingAfterBreak="0">
+  <w:abstractNum w:abstractNumId="18" w15:restartNumberingAfterBreak="0">
+    <w:nsid w:val="3E9A5584"/>
+    <w:multiLevelType w:val="hybridMultilevel"/>
+    <w:tmpl w:val="FAA2CB7A"/>
+    <w:lvl w:ilvl="0" w:tplc="40090001">
+      <w:start w:val="1"/>
+      <w:numFmt w:val="bullet"/>
+      <w:lvlText w:val=""/>
+      <w:lvlJc w:val="left"/>
+      <w:pPr>
+        <w:ind w:left="720" w:hanging="360"/>
+      </w:pPr>
+      <w:rPr>
+        <w:rFonts w:ascii="Symbol" w:hAnsi="Symbol" w:hint="default"/>
+      </w:rPr>
+    </w:lvl>
+    <w:lvl w:ilvl="1" w:tplc="40090003" w:tentative="1">
+      <w:start w:val="1"/>
+      <w:numFmt w:val="bullet"/>
+      <w:lvlText w:val="o"/>
+      <w:lvlJc w:val="left"/>
+      <w:pPr>
+        <w:ind w:left="1440" w:hanging="360"/>
+      </w:pPr>
+      <w:rPr>
+        <w:rFonts w:ascii="Courier New" w:hAnsi="Courier New" w:cs="Courier New" w:hint="default"/>
+      </w:rPr>
+    </w:lvl>
+    <w:lvl w:ilvl="2" w:tplc="40090005" w:tentative="1">
+      <w:start w:val="1"/>
+      <w:numFmt w:val="bullet"/>
+      <w:lvlText w:val=""/>
+      <w:lvlJc w:val="left"/>
+      <w:pPr>
+        <w:ind w:left="2160" w:hanging="360"/>
+      </w:pPr>
+      <w:rPr>
+        <w:rFonts w:ascii="Wingdings" w:hAnsi="Wingdings" w:hint="default"/>
+      </w:rPr>
+    </w:lvl>
+    <w:lvl w:ilvl="3" w:tplc="40090001" w:tentative="1">
+      <w:start w:val="1"/>
+      <w:numFmt w:val="bullet"/>
+      <w:lvlText w:val=""/>
+      <w:lvlJc w:val="left"/>
+      <w:pPr>
+        <w:ind w:left="2880" w:hanging="360"/>
+      </w:pPr>
+      <w:rPr>
+        <w:rFonts w:ascii="Symbol" w:hAnsi="Symbol" w:hint="default"/>
+      </w:rPr>
+    </w:lvl>
+    <w:lvl w:ilvl="4" w:tplc="40090003" w:tentative="1">
+      <w:start w:val="1"/>
+      <w:numFmt w:val="bullet"/>
+      <w:lvlText w:val="o"/>
+      <w:lvlJc w:val="left"/>
+      <w:pPr>
+        <w:ind w:left="3600" w:hanging="360"/>
+      </w:pPr>
+      <w:rPr>
+        <w:rFonts w:ascii="Courier New" w:hAnsi="Courier New" w:cs="Courier New" w:hint="default"/>
+      </w:rPr>
+    </w:lvl>
+    <w:lvl w:ilvl="5" w:tplc="40090005" w:tentative="1">
+      <w:start w:val="1"/>
+      <w:numFmt w:val="bullet"/>
+      <w:lvlText w:val=""/>
+      <w:lvlJc w:val="left"/>
+      <w:pPr>
+        <w:ind w:left="4320" w:hanging="360"/>
+      </w:pPr>
+      <w:rPr>
+        <w:rFonts w:ascii="Wingdings" w:hAnsi="Wingdings" w:hint="default"/>
+      </w:rPr>
+    </w:lvl>
+    <w:lvl w:ilvl="6" w:tplc="40090001" w:tentative="1">
+      <w:start w:val="1"/>
+      <w:numFmt w:val="bullet"/>
+      <w:lvlText w:val=""/>
+      <w:lvlJc w:val="left"/>
+      <w:pPr>
+        <w:ind w:left="5040" w:hanging="360"/>
+      </w:pPr>
+      <w:rPr>
+        <w:rFonts w:ascii="Symbol" w:hAnsi="Symbol" w:hint="default"/>
+      </w:rPr>
+    </w:lvl>
+    <w:lvl w:ilvl="7" w:tplc="40090003" w:tentative="1">
+      <w:start w:val="1"/>
+      <w:numFmt w:val="bullet"/>
+      <w:lvlText w:val="o"/>
+      <w:lvlJc w:val="left"/>
+      <w:pPr>
+        <w:ind w:left="5760" w:hanging="360"/>
+      </w:pPr>
+      <w:rPr>
+        <w:rFonts w:ascii="Courier New" w:hAnsi="Courier New" w:cs="Courier New" w:hint="default"/>
+      </w:rPr>
+    </w:lvl>
+    <w:lvl w:ilvl="8" w:tplc="40090005" w:tentative="1">
+      <w:start w:val="1"/>
+      <w:numFmt w:val="bullet"/>
+      <w:lvlText w:val=""/>
+      <w:lvlJc w:val="left"/>
+      <w:pPr>
+        <w:ind w:left="6480" w:hanging="360"/>
+      </w:pPr>
+      <w:rPr>
+        <w:rFonts w:ascii="Wingdings" w:hAnsi="Wingdings" w:hint="default"/>
+      </w:rPr>
+    </w:lvl>
+  </w:abstractNum>
+  <w:abstractNum w:abstractNumId="19" w15:restartNumberingAfterBreak="0">
     <w:nsid w:val="427A0F02"/>
     <w:multiLevelType w:val="multilevel"/>
     <w:tmpl w:val="C3729566"/>
@@ -10875,7 +12420,7 @@
       </w:rPr>
     </w:lvl>
   </w:abstractNum>
-  <w:abstractNum w:abstractNumId="18" w15:restartNumberingAfterBreak="0">
+  <w:abstractNum w:abstractNumId="20" w15:restartNumberingAfterBreak="0">
     <w:nsid w:val="44CA38DD"/>
     <w:multiLevelType w:val="multilevel"/>
     <w:tmpl w:val="6EE60E58"/>
@@ -11024,7 +12569,7 @@
       </w:rPr>
     </w:lvl>
   </w:abstractNum>
-  <w:abstractNum w:abstractNumId="19" w15:restartNumberingAfterBreak="0">
+  <w:abstractNum w:abstractNumId="21" w15:restartNumberingAfterBreak="0">
     <w:nsid w:val="4E0F61A6"/>
     <w:multiLevelType w:val="multilevel"/>
     <w:tmpl w:val="EED291EC"/>
@@ -11173,7 +12718,7 @@
       </w:rPr>
     </w:lvl>
   </w:abstractNum>
-  <w:abstractNum w:abstractNumId="20" w15:restartNumberingAfterBreak="0">
+  <w:abstractNum w:abstractNumId="22" w15:restartNumberingAfterBreak="0">
     <w:nsid w:val="558F08C4"/>
     <w:multiLevelType w:val="multilevel"/>
     <w:tmpl w:val="CC7426EE"/>
@@ -11322,7 +12867,7 @@
       </w:rPr>
     </w:lvl>
   </w:abstractNum>
-  <w:abstractNum w:abstractNumId="21" w15:restartNumberingAfterBreak="0">
+  <w:abstractNum w:abstractNumId="23" w15:restartNumberingAfterBreak="0">
     <w:nsid w:val="5B743E27"/>
     <w:multiLevelType w:val="multilevel"/>
     <w:tmpl w:val="22D6AECE"/>
@@ -11471,7 +13016,7 @@
       </w:rPr>
     </w:lvl>
   </w:abstractNum>
-  <w:abstractNum w:abstractNumId="22" w15:restartNumberingAfterBreak="0">
+  <w:abstractNum w:abstractNumId="24" w15:restartNumberingAfterBreak="0">
     <w:nsid w:val="5E06471C"/>
     <w:multiLevelType w:val="multilevel"/>
     <w:tmpl w:val="68DA127C"/>
@@ -11620,7 +13165,7 @@
       </w:rPr>
     </w:lvl>
   </w:abstractNum>
-  <w:abstractNum w:abstractNumId="23" w15:restartNumberingAfterBreak="0">
+  <w:abstractNum w:abstractNumId="25" w15:restartNumberingAfterBreak="0">
     <w:nsid w:val="5E2616FD"/>
     <w:multiLevelType w:val="multilevel"/>
     <w:tmpl w:val="3B2696DE"/>
@@ -11769,7 +13314,156 @@
       </w:rPr>
     </w:lvl>
   </w:abstractNum>
-  <w:abstractNum w:abstractNumId="24" w15:restartNumberingAfterBreak="0">
+  <w:abstractNum w:abstractNumId="26" w15:restartNumberingAfterBreak="0">
+    <w:nsid w:val="5E342844"/>
+    <w:multiLevelType w:val="multilevel"/>
+    <w:tmpl w:val="D86C390A"/>
+    <w:lvl w:ilvl="0">
+      <w:start w:val="1"/>
+      <w:numFmt w:val="bullet"/>
+      <w:lvlText w:val=""/>
+      <w:lvlJc w:val="left"/>
+      <w:pPr>
+        <w:tabs>
+          <w:tab w:val="num" w:pos="720"/>
+        </w:tabs>
+        <w:ind w:left="720" w:hanging="360"/>
+      </w:pPr>
+      <w:rPr>
+        <w:rFonts w:ascii="Symbol" w:hAnsi="Symbol" w:hint="default"/>
+        <w:sz w:val="20"/>
+      </w:rPr>
+    </w:lvl>
+    <w:lvl w:ilvl="1" w:tentative="1">
+      <w:start w:val="1"/>
+      <w:numFmt w:val="bullet"/>
+      <w:lvlText w:val=""/>
+      <w:lvlJc w:val="left"/>
+      <w:pPr>
+        <w:tabs>
+          <w:tab w:val="num" w:pos="1440"/>
+        </w:tabs>
+        <w:ind w:left="1440" w:hanging="360"/>
+      </w:pPr>
+      <w:rPr>
+        <w:rFonts w:ascii="Symbol" w:hAnsi="Symbol" w:hint="default"/>
+        <w:sz w:val="20"/>
+      </w:rPr>
+    </w:lvl>
+    <w:lvl w:ilvl="2" w:tentative="1">
+      <w:start w:val="1"/>
+      <w:numFmt w:val="bullet"/>
+      <w:lvlText w:val=""/>
+      <w:lvlJc w:val="left"/>
+      <w:pPr>
+        <w:tabs>
+          <w:tab w:val="num" w:pos="2160"/>
+        </w:tabs>
+        <w:ind w:left="2160" w:hanging="360"/>
+      </w:pPr>
+      <w:rPr>
+        <w:rFonts w:ascii="Symbol" w:hAnsi="Symbol" w:hint="default"/>
+        <w:sz w:val="20"/>
+      </w:rPr>
+    </w:lvl>
+    <w:lvl w:ilvl="3" w:tentative="1">
+      <w:start w:val="1"/>
+      <w:numFmt w:val="bullet"/>
+      <w:lvlText w:val=""/>
+      <w:lvlJc w:val="left"/>
+      <w:pPr>
+        <w:tabs>
+          <w:tab w:val="num" w:pos="2880"/>
+        </w:tabs>
+        <w:ind w:left="2880" w:hanging="360"/>
+      </w:pPr>
+      <w:rPr>
+        <w:rFonts w:ascii="Symbol" w:hAnsi="Symbol" w:hint="default"/>
+        <w:sz w:val="20"/>
+      </w:rPr>
+    </w:lvl>
+    <w:lvl w:ilvl="4" w:tentative="1">
+      <w:start w:val="1"/>
+      <w:numFmt w:val="bullet"/>
+      <w:lvlText w:val=""/>
+      <w:lvlJc w:val="left"/>
+      <w:pPr>
+        <w:tabs>
+          <w:tab w:val="num" w:pos="3600"/>
+        </w:tabs>
+        <w:ind w:left="3600" w:hanging="360"/>
+      </w:pPr>
+      <w:rPr>
+        <w:rFonts w:ascii="Symbol" w:hAnsi="Symbol" w:hint="default"/>
+        <w:sz w:val="20"/>
+      </w:rPr>
+    </w:lvl>
+    <w:lvl w:ilvl="5" w:tentative="1">
+      <w:start w:val="1"/>
+      <w:numFmt w:val="bullet"/>
+      <w:lvlText w:val=""/>
+      <w:lvlJc w:val="left"/>
+      <w:pPr>
+        <w:tabs>
+          <w:tab w:val="num" w:pos="4320"/>
+        </w:tabs>
+        <w:ind w:left="4320" w:hanging="360"/>
+      </w:pPr>
+      <w:rPr>
+        <w:rFonts w:ascii="Symbol" w:hAnsi="Symbol" w:hint="default"/>
+        <w:sz w:val="20"/>
+      </w:rPr>
+    </w:lvl>
+    <w:lvl w:ilvl="6" w:tentative="1">
+      <w:start w:val="1"/>
+      <w:numFmt w:val="bullet"/>
+      <w:lvlText w:val=""/>
+      <w:lvlJc w:val="left"/>
+      <w:pPr>
+        <w:tabs>
+          <w:tab w:val="num" w:pos="5040"/>
+        </w:tabs>
+        <w:ind w:left="5040" w:hanging="360"/>
+      </w:pPr>
+      <w:rPr>
+        <w:rFonts w:ascii="Symbol" w:hAnsi="Symbol" w:hint="default"/>
+        <w:sz w:val="20"/>
+      </w:rPr>
+    </w:lvl>
+    <w:lvl w:ilvl="7" w:tentative="1">
+      <w:start w:val="1"/>
+      <w:numFmt w:val="bullet"/>
+      <w:lvlText w:val=""/>
+      <w:lvlJc w:val="left"/>
+      <w:pPr>
+        <w:tabs>
+          <w:tab w:val="num" w:pos="5760"/>
+        </w:tabs>
+        <w:ind w:left="5760" w:hanging="360"/>
+      </w:pPr>
+      <w:rPr>
+        <w:rFonts w:ascii="Symbol" w:hAnsi="Symbol" w:hint="default"/>
+        <w:sz w:val="20"/>
+      </w:rPr>
+    </w:lvl>
+    <w:lvl w:ilvl="8" w:tentative="1">
+      <w:start w:val="1"/>
+      <w:numFmt w:val="bullet"/>
+      <w:lvlText w:val=""/>
+      <w:lvlJc w:val="left"/>
+      <w:pPr>
+        <w:tabs>
+          <w:tab w:val="num" w:pos="6480"/>
+        </w:tabs>
+        <w:ind w:left="6480" w:hanging="360"/>
+      </w:pPr>
+      <w:rPr>
+        <w:rFonts w:ascii="Symbol" w:hAnsi="Symbol" w:hint="default"/>
+        <w:sz w:val="20"/>
+      </w:rPr>
+    </w:lvl>
+  </w:abstractNum>
+  <w:abstractNum w:abstractNumId="27" w15:restartNumberingAfterBreak="0">
     <w:nsid w:val="5E46649F"/>
     <w:multiLevelType w:val="multilevel"/>
     <w:tmpl w:val="F5C2D744"/>
@@ -11918,7 +13612,7 @@
       </w:rPr>
     </w:lvl>
   </w:abstractNum>
-  <w:abstractNum w:abstractNumId="25" w15:restartNumberingAfterBreak="0">
+  <w:abstractNum w:abstractNumId="28" w15:restartNumberingAfterBreak="0">
     <w:nsid w:val="63B60229"/>
     <w:multiLevelType w:val="multilevel"/>
     <w:tmpl w:val="2F7C13AA"/>
@@ -12067,7 +13761,7 @@
       </w:rPr>
     </w:lvl>
   </w:abstractNum>
-  <w:abstractNum w:abstractNumId="26" w15:restartNumberingAfterBreak="0">
+  <w:abstractNum w:abstractNumId="29" w15:restartNumberingAfterBreak="0">
     <w:nsid w:val="64486E75"/>
     <w:multiLevelType w:val="multilevel"/>
     <w:tmpl w:val="8CDC3D14"/>
@@ -12216,7 +13910,7 @@
       </w:rPr>
     </w:lvl>
   </w:abstractNum>
-  <w:abstractNum w:abstractNumId="27" w15:restartNumberingAfterBreak="0">
+  <w:abstractNum w:abstractNumId="30" w15:restartNumberingAfterBreak="0">
     <w:nsid w:val="65E552EF"/>
     <w:multiLevelType w:val="multilevel"/>
     <w:tmpl w:val="BD42175C"/>
@@ -12329,7 +14023,7 @@
       </w:pPr>
     </w:lvl>
   </w:abstractNum>
-  <w:abstractNum w:abstractNumId="28" w15:restartNumberingAfterBreak="0">
+  <w:abstractNum w:abstractNumId="31" w15:restartNumberingAfterBreak="0">
     <w:nsid w:val="69BE5C91"/>
     <w:multiLevelType w:val="multilevel"/>
     <w:tmpl w:val="0700E83C"/>
@@ -12478,7 +14172,7 @@
       </w:rPr>
     </w:lvl>
   </w:abstractNum>
-  <w:abstractNum w:abstractNumId="29" w15:restartNumberingAfterBreak="0">
+  <w:abstractNum w:abstractNumId="32" w15:restartNumberingAfterBreak="0">
     <w:nsid w:val="6E255617"/>
     <w:multiLevelType w:val="multilevel"/>
     <w:tmpl w:val="10B8B17A"/>
@@ -12627,7 +14321,7 @@
       </w:rPr>
     </w:lvl>
   </w:abstractNum>
-  <w:abstractNum w:abstractNumId="30" w15:restartNumberingAfterBreak="0">
+  <w:abstractNum w:abstractNumId="33" w15:restartNumberingAfterBreak="0">
     <w:nsid w:val="705F4F17"/>
     <w:multiLevelType w:val="hybridMultilevel"/>
     <w:tmpl w:val="BA9A316C"/>
@@ -12740,7 +14434,7 @@
       </w:rPr>
     </w:lvl>
   </w:abstractNum>
-  <w:abstractNum w:abstractNumId="31" w15:restartNumberingAfterBreak="0">
+  <w:abstractNum w:abstractNumId="34" w15:restartNumberingAfterBreak="0">
     <w:nsid w:val="7AD62B36"/>
     <w:multiLevelType w:val="multilevel"/>
     <w:tmpl w:val="073A77CA"/>
@@ -12889,7 +14583,7 @@
       </w:rPr>
     </w:lvl>
   </w:abstractNum>
-  <w:abstractNum w:abstractNumId="32" w15:restartNumberingAfterBreak="0">
+  <w:abstractNum w:abstractNumId="35" w15:restartNumberingAfterBreak="0">
     <w:nsid w:val="7CDC4F97"/>
     <w:multiLevelType w:val="multilevel"/>
     <w:tmpl w:val="26061A48"/>
@@ -13045,97 +14739,106 @@
     <w:abstractNumId w:val="2"/>
   </w:num>
   <w:num w:numId="3" w16cid:durableId="1636989486">
-    <w:abstractNumId w:val="18"/>
+    <w:abstractNumId w:val="20"/>
   </w:num>
   <w:num w:numId="4" w16cid:durableId="901672534">
     <w:abstractNumId w:val="0"/>
   </w:num>
   <w:num w:numId="5" w16cid:durableId="1805274409">
+    <w:abstractNumId w:val="9"/>
+  </w:num>
+  <w:num w:numId="6" w16cid:durableId="1597981547">
+    <w:abstractNumId w:val="28"/>
+  </w:num>
+  <w:num w:numId="7" w16cid:durableId="1889296237">
+    <w:abstractNumId w:val="4"/>
+  </w:num>
+  <w:num w:numId="8" w16cid:durableId="240023260">
+    <w:abstractNumId w:val="14"/>
+  </w:num>
+  <w:num w:numId="9" w16cid:durableId="1150441068">
+    <w:abstractNumId w:val="12"/>
+  </w:num>
+  <w:num w:numId="10" w16cid:durableId="783771000">
+    <w:abstractNumId w:val="13"/>
+  </w:num>
+  <w:num w:numId="11" w16cid:durableId="1382094839">
+    <w:abstractNumId w:val="35"/>
+  </w:num>
+  <w:num w:numId="12" w16cid:durableId="1123885667">
+    <w:abstractNumId w:val="11"/>
+  </w:num>
+  <w:num w:numId="13" w16cid:durableId="1074864028">
+    <w:abstractNumId w:val="24"/>
+  </w:num>
+  <w:num w:numId="14" w16cid:durableId="1433479759">
+    <w:abstractNumId w:val="21"/>
+  </w:num>
+  <w:num w:numId="15" w16cid:durableId="44910288">
+    <w:abstractNumId w:val="27"/>
+  </w:num>
+  <w:num w:numId="16" w16cid:durableId="562063083">
+    <w:abstractNumId w:val="25"/>
+  </w:num>
+  <w:num w:numId="17" w16cid:durableId="774057614">
+    <w:abstractNumId w:val="15"/>
+  </w:num>
+  <w:num w:numId="18" w16cid:durableId="1399399280">
+    <w:abstractNumId w:val="6"/>
+  </w:num>
+  <w:num w:numId="19" w16cid:durableId="215241674">
+    <w:abstractNumId w:val="19"/>
+  </w:num>
+  <w:num w:numId="20" w16cid:durableId="2009864761">
+    <w:abstractNumId w:val="17"/>
+  </w:num>
+  <w:num w:numId="21" w16cid:durableId="290938284">
+    <w:abstractNumId w:val="34"/>
+  </w:num>
+  <w:num w:numId="22" w16cid:durableId="1149396956">
+    <w:abstractNumId w:val="10"/>
+  </w:num>
+  <w:num w:numId="23" w16cid:durableId="1291594710">
+    <w:abstractNumId w:val="23"/>
+  </w:num>
+  <w:num w:numId="24" w16cid:durableId="1394431693">
     <w:abstractNumId w:val="8"/>
   </w:num>
-  <w:num w:numId="6" w16cid:durableId="1597981547">
-    <w:abstractNumId w:val="25"/>
+  <w:num w:numId="25" w16cid:durableId="1845046722">
+    <w:abstractNumId w:val="16"/>
   </w:num>
-  <w:num w:numId="7" w16cid:durableId="1889296237">
+  <w:num w:numId="26" w16cid:durableId="1061556718">
+    <w:abstractNumId w:val="5"/>
+  </w:num>
+  <w:num w:numId="27" w16cid:durableId="447048862">
+    <w:abstractNumId w:val="32"/>
+  </w:num>
+  <w:num w:numId="28" w16cid:durableId="1182627561">
+    <w:abstractNumId w:val="30"/>
+  </w:num>
+  <w:num w:numId="29" w16cid:durableId="1583374768">
+    <w:abstractNumId w:val="29"/>
+  </w:num>
+  <w:num w:numId="30" w16cid:durableId="1670671815">
+    <w:abstractNumId w:val="22"/>
+  </w:num>
+  <w:num w:numId="31" w16cid:durableId="1874810074">
+    <w:abstractNumId w:val="31"/>
+  </w:num>
+  <w:num w:numId="32" w16cid:durableId="168177438">
+    <w:abstractNumId w:val="7"/>
+  </w:num>
+  <w:num w:numId="33" w16cid:durableId="158236035">
+    <w:abstractNumId w:val="33"/>
+  </w:num>
+  <w:num w:numId="34" w16cid:durableId="1598832577">
+    <w:abstractNumId w:val="26"/>
+  </w:num>
+  <w:num w:numId="35" w16cid:durableId="2086219385">
     <w:abstractNumId w:val="3"/>
   </w:num>
-  <w:num w:numId="8" w16cid:durableId="240023260">
-    <w:abstractNumId w:val="13"/>
-  </w:num>
-  <w:num w:numId="9" w16cid:durableId="1150441068">
-    <w:abstractNumId w:val="11"/>
-  </w:num>
-  <w:num w:numId="10" w16cid:durableId="783771000">
-    <w:abstractNumId w:val="12"/>
-  </w:num>
-  <w:num w:numId="11" w16cid:durableId="1382094839">
-    <w:abstractNumId w:val="32"/>
-  </w:num>
-  <w:num w:numId="12" w16cid:durableId="1123885667">
-    <w:abstractNumId w:val="10"/>
-  </w:num>
-  <w:num w:numId="13" w16cid:durableId="1074864028">
-    <w:abstractNumId w:val="22"/>
-  </w:num>
-  <w:num w:numId="14" w16cid:durableId="1433479759">
-    <w:abstractNumId w:val="19"/>
-  </w:num>
-  <w:num w:numId="15" w16cid:durableId="44910288">
-    <w:abstractNumId w:val="24"/>
-  </w:num>
-  <w:num w:numId="16" w16cid:durableId="562063083">
-    <w:abstractNumId w:val="23"/>
-  </w:num>
-  <w:num w:numId="17" w16cid:durableId="774057614">
-    <w:abstractNumId w:val="14"/>
-  </w:num>
-  <w:num w:numId="18" w16cid:durableId="1399399280">
-    <w:abstractNumId w:val="5"/>
-  </w:num>
-  <w:num w:numId="19" w16cid:durableId="215241674">
-    <w:abstractNumId w:val="17"/>
-  </w:num>
-  <w:num w:numId="20" w16cid:durableId="2009864761">
-    <w:abstractNumId w:val="16"/>
-  </w:num>
-  <w:num w:numId="21" w16cid:durableId="290938284">
-    <w:abstractNumId w:val="31"/>
-  </w:num>
-  <w:num w:numId="22" w16cid:durableId="1149396956">
-    <w:abstractNumId w:val="9"/>
-  </w:num>
-  <w:num w:numId="23" w16cid:durableId="1291594710">
-    <w:abstractNumId w:val="21"/>
-  </w:num>
-  <w:num w:numId="24" w16cid:durableId="1394431693">
-    <w:abstractNumId w:val="7"/>
-  </w:num>
-  <w:num w:numId="25" w16cid:durableId="1845046722">
-    <w:abstractNumId w:val="15"/>
-  </w:num>
-  <w:num w:numId="26" w16cid:durableId="1061556718">
-    <w:abstractNumId w:val="4"/>
-  </w:num>
-  <w:num w:numId="27" w16cid:durableId="447048862">
-    <w:abstractNumId w:val="29"/>
-  </w:num>
-  <w:num w:numId="28" w16cid:durableId="1182627561">
-    <w:abstractNumId w:val="27"/>
-  </w:num>
-  <w:num w:numId="29" w16cid:durableId="1583374768">
-    <w:abstractNumId w:val="26"/>
-  </w:num>
-  <w:num w:numId="30" w16cid:durableId="1670671815">
-    <w:abstractNumId w:val="20"/>
-  </w:num>
-  <w:num w:numId="31" w16cid:durableId="1874810074">
-    <w:abstractNumId w:val="28"/>
-  </w:num>
-  <w:num w:numId="32" w16cid:durableId="168177438">
-    <w:abstractNumId w:val="6"/>
-  </w:num>
-  <w:num w:numId="33" w16cid:durableId="158236035">
-    <w:abstractNumId w:val="30"/>
+  <w:num w:numId="36" w16cid:durableId="969743579">
+    <w:abstractNumId w:val="18"/>
   </w:num>
 </w:numbering>
 </file>
@@ -13740,6 +15443,7 @@
   <w:style w:type="character" w:default="1" w:styleId="DefaultParagraphFont">
     <w:name w:val="Default Paragraph Font"/>
     <w:uiPriority w:val="1"/>
+    <w:semiHidden/>
     <w:unhideWhenUsed/>
   </w:style>
   <w:style w:type="table" w:default="1" w:styleId="TableNormal">

</xml_diff>